<commit_message>
Third revision: correct the frontier for winner's curse and condition the sample-size claim
</commit_message>
<xml_diff>
--- a/manuscript/supplement.docx
+++ b/manuscript/supplement.docx
@@ -14869,7 +14869,7 @@
         <w:rPr>
           <w:rFonts w:ascii="Calibri" w:cs="Calibri" w:eastAsia="Calibri" w:hAnsi="Calibri"/>
         </w:rPr>
-        <w:t xml:space="preserve">Table S3. Matched and frontier comparison against all attainable subsets</w:t>
+        <w:t xml:space="preserve">Table S3. Matched and frontier comparison, with patient-level uncertainty</w:t>
       </w:r>
     </w:p>
     <w:p>
@@ -14883,7 +14883,7 @@
           <w:sz w:val="20"/>
           <w:szCs w:val="20"/>
         </w:rPr>
-        <w:t xml:space="preserve">Every one of the 512 subsets is scored on the held-out half of each split. “Matched” keeps those whose eligible count is within ten per cent of the rule's. “On the frontier” means no scored subset admits at least as many patients at a hazard ratio at least as low. Intervals are bootstrap intervals over splits and therefore narrower than the population uncertainty reported in the main text.</w:t>
+        <w:t xml:space="preserve">All 512 subsets are scored on the held-out half of each split. “Matched” keeps those whose eligible count is within the stated tolerance of the rule's. “On the frontier” means no scored subset admits at least as many patients at a hazard ratio at least as low. The proportion is computed within a split and splits are averaged with equal weight; intervals come from the outer bootstrap over patients, not from resampling splits. Rotterdam entries are descriptive, that cohort having a severe lack of empirical overlap.</w:t>
       </w:r>
     </w:p>
     <w:tbl>
@@ -14899,9 +14899,9 @@
         </w:tblBorders>
       </w:tblPr>
       <w:tblGrid>
-        <w:gridCol w:w="3800"/>
-        <w:gridCol w:w="2800"/>
-        <w:gridCol w:w="2760"/>
+        <w:gridCol w:w="3600"/>
+        <w:gridCol w:w="2900"/>
+        <w:gridCol w:w="2860"/>
       </w:tblGrid>
       <w:tr>
         <w:trPr>
@@ -14910,7 +14910,7 @@
         </w:trPr>
         <w:tc>
           <w:tcPr>
-            <w:tcW w:type="dxa" w:w="3800"/>
+            <w:tcW w:type="dxa" w:w="3600"/>
             <w:shd w:fill="EDF1F5" w:val="clear"/>
             <w:tcMar>
               <w:top w:type="dxa" w:w="50"/>
@@ -14938,7 +14938,7 @@
         </w:tc>
         <w:tc>
           <w:tcPr>
-            <w:tcW w:type="dxa" w:w="2800"/>
+            <w:tcW w:type="dxa" w:w="2900"/>
             <w:shd w:fill="EDF1F5" w:val="clear"/>
             <w:tcMar>
               <w:top w:type="dxa" w:w="50"/>
@@ -14966,7 +14966,7 @@
         </w:tc>
         <w:tc>
           <w:tcPr>
-            <w:tcW w:type="dxa" w:w="2760"/>
+            <w:tcW w:type="dxa" w:w="2860"/>
             <w:shd w:fill="EDF1F5" w:val="clear"/>
             <w:tcMar>
               <w:top w:type="dxa" w:w="50"/>
@@ -14988,7 +14988,7 @@
                 <w:sz w:val="16"/>
                 <w:szCs w:val="16"/>
               </w:rPr>
-              <w:t xml:space="preserve">Rotterdam</w:t>
+              <w:t xml:space="preserve">Rotterdam (descriptive)</w:t>
             </w:r>
           </w:p>
         </w:tc>
@@ -14999,7 +14999,7 @@
         </w:trPr>
         <w:tc>
           <w:tcPr>
-            <w:tcW w:type="dxa" w:w="3800"/>
+            <w:tcW w:type="dxa" w:w="3600"/>
             <w:tcMar>
               <w:top w:type="dxa" w:w="50"/>
               <w:left w:type="dxa" w:w="80"/>
@@ -15018,57 +15018,57 @@
                 <w:sz w:val="16"/>
                 <w:szCs w:val="16"/>
               </w:rPr>
-              <w:t xml:space="preserve">splits</w:t>
-            </w:r>
-          </w:p>
-        </w:tc>
-        <w:tc>
-          <w:tcPr>
-            <w:tcW w:type="dxa" w:w="2800"/>
-            <w:tcMar>
-              <w:top w:type="dxa" w:w="50"/>
-              <w:left w:type="dxa" w:w="80"/>
-              <w:bottom w:type="dxa" w:w="50"/>
-              <w:right w:type="dxa" w:w="80"/>
-            </w:tcMar>
-          </w:tcPr>
-          <w:p>
-            <w:pPr>
-              <w:spacing w:after="0" w:line="240"/>
-              <w:jc w:val="right"/>
-            </w:pPr>
-            <w:r>
-              <w:rPr>
-                <w:rFonts w:ascii="Calibri" w:cs="Calibri" w:eastAsia="Calibri" w:hAnsi="Calibri"/>
-                <w:sz w:val="16"/>
-                <w:szCs w:val="16"/>
-              </w:rPr>
-              <w:t xml:space="preserve">250</w:t>
-            </w:r>
-          </w:p>
-        </w:tc>
-        <w:tc>
-          <w:tcPr>
-            <w:tcW w:type="dxa" w:w="2760"/>
-            <w:tcMar>
-              <w:top w:type="dxa" w:w="50"/>
-              <w:left w:type="dxa" w:w="80"/>
-              <w:bottom w:type="dxa" w:w="50"/>
-              <w:right w:type="dxa" w:w="80"/>
-            </w:tcMar>
-          </w:tcPr>
-          <w:p>
-            <w:pPr>
-              <w:spacing w:after="0" w:line="240"/>
-              <w:jc w:val="right"/>
-            </w:pPr>
-            <w:r>
-              <w:rPr>
-                <w:rFonts w:ascii="Calibri" w:cs="Calibri" w:eastAsia="Calibri" w:hAnsi="Calibri"/>
-                <w:sz w:val="16"/>
-                <w:szCs w:val="16"/>
-              </w:rPr>
-              <w:t xml:space="preserve">200</w:t>
+              <w:t xml:space="preserve">outer resamples x inner splits</w:t>
+            </w:r>
+          </w:p>
+        </w:tc>
+        <w:tc>
+          <w:tcPr>
+            <w:tcW w:type="dxa" w:w="2900"/>
+            <w:tcMar>
+              <w:top w:type="dxa" w:w="50"/>
+              <w:left w:type="dxa" w:w="80"/>
+              <w:bottom w:type="dxa" w:w="50"/>
+              <w:right w:type="dxa" w:w="80"/>
+            </w:tcMar>
+          </w:tcPr>
+          <w:p>
+            <w:pPr>
+              <w:spacing w:after="0" w:line="240"/>
+              <w:jc w:val="right"/>
+            </w:pPr>
+            <w:r>
+              <w:rPr>
+                <w:rFonts w:ascii="Calibri" w:cs="Calibri" w:eastAsia="Calibri" w:hAnsi="Calibri"/>
+                <w:sz w:val="16"/>
+                <w:szCs w:val="16"/>
+              </w:rPr>
+              <w:t xml:space="preserve">150 x 25</w:t>
+            </w:r>
+          </w:p>
+        </w:tc>
+        <w:tc>
+          <w:tcPr>
+            <w:tcW w:type="dxa" w:w="2860"/>
+            <w:tcMar>
+              <w:top w:type="dxa" w:w="50"/>
+              <w:left w:type="dxa" w:w="80"/>
+              <w:bottom w:type="dxa" w:w="50"/>
+              <w:right w:type="dxa" w:w="80"/>
+            </w:tcMar>
+          </w:tcPr>
+          <w:p>
+            <w:pPr>
+              <w:spacing w:after="0" w:line="240"/>
+              <w:jc w:val="right"/>
+            </w:pPr>
+            <w:r>
+              <w:rPr>
+                <w:rFonts w:ascii="Calibri" w:cs="Calibri" w:eastAsia="Calibri" w:hAnsi="Calibri"/>
+                <w:sz w:val="16"/>
+                <w:szCs w:val="16"/>
+              </w:rPr>
+              <w:t xml:space="preserve">150 x 25</w:t>
             </w:r>
           </w:p>
         </w:tc>
@@ -15079,7 +15079,7 @@
         </w:trPr>
         <w:tc>
           <w:tcPr>
-            <w:tcW w:type="dxa" w:w="3800"/>
+            <w:tcW w:type="dxa" w:w="3600"/>
             <w:tcMar>
               <w:top w:type="dxa" w:w="50"/>
               <w:left w:type="dxa" w:w="80"/>
@@ -15098,57 +15098,57 @@
                 <w:sz w:val="16"/>
                 <w:szCs w:val="16"/>
               </w:rPr>
-              <w:t xml:space="preserve">matched comparators per split (median)</w:t>
-            </w:r>
-          </w:p>
-        </w:tc>
-        <w:tc>
-          <w:tcPr>
-            <w:tcW w:type="dxa" w:w="2800"/>
-            <w:tcMar>
-              <w:top w:type="dxa" w:w="50"/>
-              <w:left w:type="dxa" w:w="80"/>
-              <w:bottom w:type="dxa" w:w="50"/>
-              <w:right w:type="dxa" w:w="80"/>
-            </w:tcMar>
-          </w:tcPr>
-          <w:p>
-            <w:pPr>
-              <w:spacing w:after="0" w:line="240"/>
-              <w:jc w:val="right"/>
-            </w:pPr>
-            <w:r>
-              <w:rPr>
-                <w:rFonts w:ascii="Calibri" w:cs="Calibri" w:eastAsia="Calibri" w:hAnsi="Calibri"/>
-                <w:sz w:val="16"/>
-                <w:szCs w:val="16"/>
-              </w:rPr>
-              <w:t xml:space="preserve">123</w:t>
-            </w:r>
-          </w:p>
-        </w:tc>
-        <w:tc>
-          <w:tcPr>
-            <w:tcW w:type="dxa" w:w="2760"/>
-            <w:tcMar>
-              <w:top w:type="dxa" w:w="50"/>
-              <w:left w:type="dxa" w:w="80"/>
-              <w:bottom w:type="dxa" w:w="50"/>
-              <w:right w:type="dxa" w:w="80"/>
-            </w:tcMar>
-          </w:tcPr>
-          <w:p>
-            <w:pPr>
-              <w:spacing w:after="0" w:line="240"/>
-              <w:jc w:val="right"/>
-            </w:pPr>
-            <w:r>
-              <w:rPr>
-                <w:rFonts w:ascii="Calibri" w:cs="Calibri" w:eastAsia="Calibri" w:hAnsi="Calibri"/>
-                <w:sz w:val="16"/>
-                <w:szCs w:val="16"/>
-              </w:rPr>
-              <w:t xml:space="preserve">66</w:t>
+              <w:t xml:space="preserve">P(more eligible)</w:t>
+            </w:r>
+          </w:p>
+        </w:tc>
+        <w:tc>
+          <w:tcPr>
+            <w:tcW w:type="dxa" w:w="2900"/>
+            <w:tcMar>
+              <w:top w:type="dxa" w:w="50"/>
+              <w:left w:type="dxa" w:w="80"/>
+              <w:bottom w:type="dxa" w:w="50"/>
+              <w:right w:type="dxa" w:w="80"/>
+            </w:tcMar>
+          </w:tcPr>
+          <w:p>
+            <w:pPr>
+              <w:spacing w:after="0" w:line="240"/>
+              <w:jc w:val="right"/>
+            </w:pPr>
+            <w:r>
+              <w:rPr>
+                <w:rFonts w:ascii="Calibri" w:cs="Calibri" w:eastAsia="Calibri" w:hAnsi="Calibri"/>
+                <w:sz w:val="16"/>
+                <w:szCs w:val="16"/>
+              </w:rPr>
+              <w:t xml:space="preserve">1.000 [0.88, 1.00]</w:t>
+            </w:r>
+          </w:p>
+        </w:tc>
+        <w:tc>
+          <w:tcPr>
+            <w:tcW w:type="dxa" w:w="2860"/>
+            <w:tcMar>
+              <w:top w:type="dxa" w:w="50"/>
+              <w:left w:type="dxa" w:w="80"/>
+              <w:bottom w:type="dxa" w:w="50"/>
+              <w:right w:type="dxa" w:w="80"/>
+            </w:tcMar>
+          </w:tcPr>
+          <w:p>
+            <w:pPr>
+              <w:spacing w:after="0" w:line="240"/>
+              <w:jc w:val="right"/>
+            </w:pPr>
+            <w:r>
+              <w:rPr>
+                <w:rFonts w:ascii="Calibri" w:cs="Calibri" w:eastAsia="Calibri" w:hAnsi="Calibri"/>
+                <w:sz w:val="16"/>
+                <w:szCs w:val="16"/>
+              </w:rPr>
+              <w:t xml:space="preserve">1.000 [0.96, 1.00]</w:t>
             </w:r>
           </w:p>
         </w:tc>
@@ -15159,7 +15159,7 @@
         </w:trPr>
         <w:tc>
           <w:tcPr>
-            <w:tcW w:type="dxa" w:w="3800"/>
+            <w:tcW w:type="dxa" w:w="3600"/>
             <w:tcMar>
               <w:top w:type="dxa" w:w="50"/>
               <w:left w:type="dxa" w:w="80"/>
@@ -15178,57 +15178,57 @@
                 <w:sz w:val="16"/>
                 <w:szCs w:val="16"/>
               </w:rPr>
-              <w:t xml:space="preserve">rule beats a matched subset on log HR</w:t>
-            </w:r>
-          </w:p>
-        </w:tc>
-        <w:tc>
-          <w:tcPr>
-            <w:tcW w:type="dxa" w:w="2800"/>
-            <w:tcMar>
-              <w:top w:type="dxa" w:w="50"/>
-              <w:left w:type="dxa" w:w="80"/>
-              <w:bottom w:type="dxa" w:w="50"/>
-              <w:right w:type="dxa" w:w="80"/>
-            </w:tcMar>
-          </w:tcPr>
-          <w:p>
-            <w:pPr>
-              <w:spacing w:after="0" w:line="240"/>
-              <w:jc w:val="right"/>
-            </w:pPr>
-            <w:r>
-              <w:rPr>
-                <w:rFonts w:ascii="Calibri" w:cs="Calibri" w:eastAsia="Calibri" w:hAnsi="Calibri"/>
-                <w:sz w:val="16"/>
-                <w:szCs w:val="16"/>
-              </w:rPr>
-              <w:t xml:space="preserve">0.598 [0.568, 0.628]</w:t>
-            </w:r>
-          </w:p>
-        </w:tc>
-        <w:tc>
-          <w:tcPr>
-            <w:tcW w:type="dxa" w:w="2760"/>
-            <w:tcMar>
-              <w:top w:type="dxa" w:w="50"/>
-              <w:left w:type="dxa" w:w="80"/>
-              <w:bottom w:type="dxa" w:w="50"/>
-              <w:right w:type="dxa" w:w="80"/>
-            </w:tcMar>
-          </w:tcPr>
-          <w:p>
-            <w:pPr>
-              <w:spacing w:after="0" w:line="240"/>
-              <w:jc w:val="right"/>
-            </w:pPr>
-            <w:r>
-              <w:rPr>
-                <w:rFonts w:ascii="Calibri" w:cs="Calibri" w:eastAsia="Calibri" w:hAnsi="Calibri"/>
-                <w:sz w:val="16"/>
-                <w:szCs w:val="16"/>
-              </w:rPr>
-              <w:t xml:space="preserve">0.548 [0.509, 0.585]</w:t>
+              <w:t xml:space="preserve">P(lower hazard ratio)</w:t>
+            </w:r>
+          </w:p>
+        </w:tc>
+        <w:tc>
+          <w:tcPr>
+            <w:tcW w:type="dxa" w:w="2900"/>
+            <w:tcMar>
+              <w:top w:type="dxa" w:w="50"/>
+              <w:left w:type="dxa" w:w="80"/>
+              <w:bottom w:type="dxa" w:w="50"/>
+              <w:right w:type="dxa" w:w="80"/>
+            </w:tcMar>
+          </w:tcPr>
+          <w:p>
+            <w:pPr>
+              <w:spacing w:after="0" w:line="240"/>
+              <w:jc w:val="right"/>
+            </w:pPr>
+            <w:r>
+              <w:rPr>
+                <w:rFonts w:ascii="Calibri" w:cs="Calibri" w:eastAsia="Calibri" w:hAnsi="Calibri"/>
+                <w:sz w:val="16"/>
+                <w:szCs w:val="16"/>
+              </w:rPr>
+              <w:t xml:space="preserve">0.400 [0.04, 0.69]</w:t>
+            </w:r>
+          </w:p>
+        </w:tc>
+        <w:tc>
+          <w:tcPr>
+            <w:tcW w:type="dxa" w:w="2860"/>
+            <w:tcMar>
+              <w:top w:type="dxa" w:w="50"/>
+              <w:left w:type="dxa" w:w="80"/>
+              <w:bottom w:type="dxa" w:w="50"/>
+              <w:right w:type="dxa" w:w="80"/>
+            </w:tcMar>
+          </w:tcPr>
+          <w:p>
+            <w:pPr>
+              <w:spacing w:after="0" w:line="240"/>
+              <w:jc w:val="right"/>
+            </w:pPr>
+            <w:r>
+              <w:rPr>
+                <w:rFonts w:ascii="Calibri" w:cs="Calibri" w:eastAsia="Calibri" w:hAnsi="Calibri"/>
+                <w:sz w:val="16"/>
+                <w:szCs w:val="16"/>
+              </w:rPr>
+              <w:t xml:space="preserve">0.280 [0.12, 0.88]</w:t>
             </w:r>
           </w:p>
         </w:tc>
@@ -15239,7 +15239,7 @@
         </w:trPr>
         <w:tc>
           <w:tcPr>
-            <w:tcW w:type="dxa" w:w="3800"/>
+            <w:tcW w:type="dxa" w:w="3600"/>
             <w:tcMar>
               <w:top w:type="dxa" w:w="50"/>
               <w:left w:type="dxa" w:w="80"/>
@@ -15258,57 +15258,57 @@
                 <w:sz w:val="16"/>
                 <w:szCs w:val="16"/>
               </w:rPr>
-              <w:t xml:space="preserve">rule beats a matched subset on RMST</w:t>
-            </w:r>
-          </w:p>
-        </w:tc>
-        <w:tc>
-          <w:tcPr>
-            <w:tcW w:type="dxa" w:w="2800"/>
-            <w:tcMar>
-              <w:top w:type="dxa" w:w="50"/>
-              <w:left w:type="dxa" w:w="80"/>
-              <w:bottom w:type="dxa" w:w="50"/>
-              <w:right w:type="dxa" w:w="80"/>
-            </w:tcMar>
-          </w:tcPr>
-          <w:p>
-            <w:pPr>
-              <w:spacing w:after="0" w:line="240"/>
-              <w:jc w:val="right"/>
-            </w:pPr>
-            <w:r>
-              <w:rPr>
-                <w:rFonts w:ascii="Calibri" w:cs="Calibri" w:eastAsia="Calibri" w:hAnsi="Calibri"/>
-                <w:sz w:val="16"/>
-                <w:szCs w:val="16"/>
-              </w:rPr>
-              <w:t xml:space="preserve">0.427 [0.395, 0.459]</w:t>
-            </w:r>
-          </w:p>
-        </w:tc>
-        <w:tc>
-          <w:tcPr>
-            <w:tcW w:type="dxa" w:w="2760"/>
-            <w:tcMar>
-              <w:top w:type="dxa" w:w="50"/>
-              <w:left w:type="dxa" w:w="80"/>
-              <w:bottom w:type="dxa" w:w="50"/>
-              <w:right w:type="dxa" w:w="80"/>
-            </w:tcMar>
-          </w:tcPr>
-          <w:p>
-            <w:pPr>
-              <w:spacing w:after="0" w:line="240"/>
-              <w:jc w:val="right"/>
-            </w:pPr>
-            <w:r>
-              <w:rPr>
-                <w:rFonts w:ascii="Calibri" w:cs="Calibri" w:eastAsia="Calibri" w:hAnsi="Calibri"/>
-                <w:sz w:val="16"/>
-                <w:szCs w:val="16"/>
-              </w:rPr>
-              <w:t xml:space="preserve">0.515 [0.473, 0.555]</w:t>
+              <w:t xml:space="preserve">matched on HR, band 2%</w:t>
+            </w:r>
+          </w:p>
+        </w:tc>
+        <w:tc>
+          <w:tcPr>
+            <w:tcW w:type="dxa" w:w="2900"/>
+            <w:tcMar>
+              <w:top w:type="dxa" w:w="50"/>
+              <w:left w:type="dxa" w:w="80"/>
+              <w:bottom w:type="dxa" w:w="50"/>
+              <w:right w:type="dxa" w:w="80"/>
+            </w:tcMar>
+          </w:tcPr>
+          <w:p>
+            <w:pPr>
+              <w:spacing w:after="0" w:line="240"/>
+              <w:jc w:val="right"/>
+            </w:pPr>
+            <w:r>
+              <w:rPr>
+                <w:rFonts w:ascii="Calibri" w:cs="Calibri" w:eastAsia="Calibri" w:hAnsi="Calibri"/>
+                <w:sz w:val="16"/>
+                <w:szCs w:val="16"/>
+              </w:rPr>
+              <w:t xml:space="preserve">0.553 [0.26, 0.74]</w:t>
+            </w:r>
+          </w:p>
+        </w:tc>
+        <w:tc>
+          <w:tcPr>
+            <w:tcW w:type="dxa" w:w="2860"/>
+            <w:tcMar>
+              <w:top w:type="dxa" w:w="50"/>
+              <w:left w:type="dxa" w:w="80"/>
+              <w:bottom w:type="dxa" w:w="50"/>
+              <w:right w:type="dxa" w:w="80"/>
+            </w:tcMar>
+          </w:tcPr>
+          <w:p>
+            <w:pPr>
+              <w:spacing w:after="0" w:line="240"/>
+              <w:jc w:val="right"/>
+            </w:pPr>
+            <w:r>
+              <w:rPr>
+                <w:rFonts w:ascii="Calibri" w:cs="Calibri" w:eastAsia="Calibri" w:hAnsi="Calibri"/>
+                <w:sz w:val="16"/>
+                <w:szCs w:val="16"/>
+              </w:rPr>
+              <w:t xml:space="preserve">0.542 [0.34, 0.72]</w:t>
             </w:r>
           </w:p>
         </w:tc>
@@ -15319,7 +15319,7 @@
         </w:trPr>
         <w:tc>
           <w:tcPr>
-            <w:tcW w:type="dxa" w:w="3800"/>
+            <w:tcW w:type="dxa" w:w="3600"/>
             <w:tcMar>
               <w:top w:type="dxa" w:w="50"/>
               <w:left w:type="dxa" w:w="80"/>
@@ -15338,57 +15338,57 @@
                 <w:sz w:val="16"/>
                 <w:szCs w:val="16"/>
               </w:rPr>
-              <w:t xml:space="preserve">rule on the count/HR frontier</w:t>
-            </w:r>
-          </w:p>
-        </w:tc>
-        <w:tc>
-          <w:tcPr>
-            <w:tcW w:type="dxa" w:w="2800"/>
-            <w:tcMar>
-              <w:top w:type="dxa" w:w="50"/>
-              <w:left w:type="dxa" w:w="80"/>
-              <w:bottom w:type="dxa" w:w="50"/>
-              <w:right w:type="dxa" w:w="80"/>
-            </w:tcMar>
-          </w:tcPr>
-          <w:p>
-            <w:pPr>
-              <w:spacing w:after="0" w:line="240"/>
-              <w:jc w:val="right"/>
-            </w:pPr>
-            <w:r>
-              <w:rPr>
-                <w:rFonts w:ascii="Calibri" w:cs="Calibri" w:eastAsia="Calibri" w:hAnsi="Calibri"/>
-                <w:sz w:val="16"/>
-                <w:szCs w:val="16"/>
-              </w:rPr>
-              <w:t xml:space="preserve">0.016 [0.004, 0.032]</w:t>
-            </w:r>
-          </w:p>
-        </w:tc>
-        <w:tc>
-          <w:tcPr>
-            <w:tcW w:type="dxa" w:w="2760"/>
-            <w:tcMar>
-              <w:top w:type="dxa" w:w="50"/>
-              <w:left w:type="dxa" w:w="80"/>
-              <w:bottom w:type="dxa" w:w="50"/>
-              <w:right w:type="dxa" w:w="80"/>
-            </w:tcMar>
-          </w:tcPr>
-          <w:p>
-            <w:pPr>
-              <w:spacing w:after="0" w:line="240"/>
-              <w:jc w:val="right"/>
-            </w:pPr>
-            <w:r>
-              <w:rPr>
-                <w:rFonts w:ascii="Calibri" w:cs="Calibri" w:eastAsia="Calibri" w:hAnsi="Calibri"/>
-                <w:sz w:val="16"/>
-                <w:szCs w:val="16"/>
-              </w:rPr>
-              <w:t xml:space="preserve">0.030 [0.010, 0.055]</w:t>
+              <w:t xml:space="preserve">matched on HR, band 5%</w:t>
+            </w:r>
+          </w:p>
+        </w:tc>
+        <w:tc>
+          <w:tcPr>
+            <w:tcW w:type="dxa" w:w="2900"/>
+            <w:tcMar>
+              <w:top w:type="dxa" w:w="50"/>
+              <w:left w:type="dxa" w:w="80"/>
+              <w:bottom w:type="dxa" w:w="50"/>
+              <w:right w:type="dxa" w:w="80"/>
+            </w:tcMar>
+          </w:tcPr>
+          <w:p>
+            <w:pPr>
+              <w:spacing w:after="0" w:line="240"/>
+              <w:jc w:val="right"/>
+            </w:pPr>
+            <w:r>
+              <w:rPr>
+                <w:rFonts w:ascii="Calibri" w:cs="Calibri" w:eastAsia="Calibri" w:hAnsi="Calibri"/>
+                <w:sz w:val="16"/>
+                <w:szCs w:val="16"/>
+              </w:rPr>
+              <w:t xml:space="preserve">0.568 [0.29, 0.77]</w:t>
+            </w:r>
+          </w:p>
+        </w:tc>
+        <w:tc>
+          <w:tcPr>
+            <w:tcW w:type="dxa" w:w="2860"/>
+            <w:tcMar>
+              <w:top w:type="dxa" w:w="50"/>
+              <w:left w:type="dxa" w:w="80"/>
+              <w:bottom w:type="dxa" w:w="50"/>
+              <w:right w:type="dxa" w:w="80"/>
+            </w:tcMar>
+          </w:tcPr>
+          <w:p>
+            <w:pPr>
+              <w:spacing w:after="0" w:line="240"/>
+              <w:jc w:val="right"/>
+            </w:pPr>
+            <w:r>
+              <w:rPr>
+                <w:rFonts w:ascii="Calibri" w:cs="Calibri" w:eastAsia="Calibri" w:hAnsi="Calibri"/>
+                <w:sz w:val="16"/>
+                <w:szCs w:val="16"/>
+              </w:rPr>
+              <w:t xml:space="preserve">0.512 [0.34, 0.74]</w:t>
             </w:r>
           </w:p>
         </w:tc>
@@ -15399,7 +15399,7 @@
         </w:trPr>
         <w:tc>
           <w:tcPr>
-            <w:tcW w:type="dxa" w:w="3800"/>
+            <w:tcW w:type="dxa" w:w="3600"/>
             <w:tcMar>
               <w:top w:type="dxa" w:w="50"/>
               <w:left w:type="dxa" w:w="80"/>
@@ -15418,57 +15418,57 @@
                 <w:sz w:val="16"/>
                 <w:szCs w:val="16"/>
               </w:rPr>
-              <w:t xml:space="preserve">rule on the count/RMST frontier</w:t>
-            </w:r>
-          </w:p>
-        </w:tc>
-        <w:tc>
-          <w:tcPr>
-            <w:tcW w:type="dxa" w:w="2800"/>
-            <w:tcMar>
-              <w:top w:type="dxa" w:w="50"/>
-              <w:left w:type="dxa" w:w="80"/>
-              <w:bottom w:type="dxa" w:w="50"/>
-              <w:right w:type="dxa" w:w="80"/>
-            </w:tcMar>
-          </w:tcPr>
-          <w:p>
-            <w:pPr>
-              <w:spacing w:after="0" w:line="240"/>
-              <w:jc w:val="right"/>
-            </w:pPr>
-            <w:r>
-              <w:rPr>
-                <w:rFonts w:ascii="Calibri" w:cs="Calibri" w:eastAsia="Calibri" w:hAnsi="Calibri"/>
-                <w:sz w:val="16"/>
-                <w:szCs w:val="16"/>
-              </w:rPr>
-              <w:t xml:space="preserve">0.004 [0.000, 0.012]</w:t>
-            </w:r>
-          </w:p>
-        </w:tc>
-        <w:tc>
-          <w:tcPr>
-            <w:tcW w:type="dxa" w:w="2760"/>
-            <w:tcMar>
-              <w:top w:type="dxa" w:w="50"/>
-              <w:left w:type="dxa" w:w="80"/>
-              <w:bottom w:type="dxa" w:w="50"/>
-              <w:right w:type="dxa" w:w="80"/>
-            </w:tcMar>
-          </w:tcPr>
-          <w:p>
-            <w:pPr>
-              <w:spacing w:after="0" w:line="240"/>
-              <w:jc w:val="right"/>
-            </w:pPr>
-            <w:r>
-              <w:rPr>
-                <w:rFonts w:ascii="Calibri" w:cs="Calibri" w:eastAsia="Calibri" w:hAnsi="Calibri"/>
-                <w:sz w:val="16"/>
-                <w:szCs w:val="16"/>
-              </w:rPr>
-              <w:t xml:space="preserve">0.050 [0.020, 0.080]</w:t>
+              <w:t xml:space="preserve">matched on HR, band 10%</w:t>
+            </w:r>
+          </w:p>
+        </w:tc>
+        <w:tc>
+          <w:tcPr>
+            <w:tcW w:type="dxa" w:w="2900"/>
+            <w:tcMar>
+              <w:top w:type="dxa" w:w="50"/>
+              <w:left w:type="dxa" w:w="80"/>
+              <w:bottom w:type="dxa" w:w="50"/>
+              <w:right w:type="dxa" w:w="80"/>
+            </w:tcMar>
+          </w:tcPr>
+          <w:p>
+            <w:pPr>
+              <w:spacing w:after="0" w:line="240"/>
+              <w:jc w:val="right"/>
+            </w:pPr>
+            <w:r>
+              <w:rPr>
+                <w:rFonts w:ascii="Calibri" w:cs="Calibri" w:eastAsia="Calibri" w:hAnsi="Calibri"/>
+                <w:sz w:val="16"/>
+                <w:szCs w:val="16"/>
+              </w:rPr>
+              <w:t xml:space="preserve">0.564 [0.31, 0.77]</w:t>
+            </w:r>
+          </w:p>
+        </w:tc>
+        <w:tc>
+          <w:tcPr>
+            <w:tcW w:type="dxa" w:w="2860"/>
+            <w:tcMar>
+              <w:top w:type="dxa" w:w="50"/>
+              <w:left w:type="dxa" w:w="80"/>
+              <w:bottom w:type="dxa" w:w="50"/>
+              <w:right w:type="dxa" w:w="80"/>
+            </w:tcMar>
+          </w:tcPr>
+          <w:p>
+            <w:pPr>
+              <w:spacing w:after="0" w:line="240"/>
+              <w:jc w:val="right"/>
+            </w:pPr>
+            <w:r>
+              <w:rPr>
+                <w:rFonts w:ascii="Calibri" w:cs="Calibri" w:eastAsia="Calibri" w:hAnsi="Calibri"/>
+                <w:sz w:val="16"/>
+                <w:szCs w:val="16"/>
+              </w:rPr>
+              <w:t xml:space="preserve">0.496 [0.35, 0.73]</w:t>
             </w:r>
           </w:p>
         </w:tc>
@@ -15479,7 +15479,7 @@
         </w:trPr>
         <w:tc>
           <w:tcPr>
-            <w:tcW w:type="dxa" w:w="3800"/>
+            <w:tcW w:type="dxa" w:w="3600"/>
             <w:tcMar>
               <w:top w:type="dxa" w:w="50"/>
               <w:left w:type="dxa" w:w="80"/>
@@ -15498,57 +15498,617 @@
                 <w:sz w:val="16"/>
                 <w:szCs w:val="16"/>
               </w:rPr>
-              <w:t xml:space="preserve">subsets dominating the rule (median)</w:t>
-            </w:r>
-          </w:p>
-        </w:tc>
-        <w:tc>
-          <w:tcPr>
-            <w:tcW w:type="dxa" w:w="2800"/>
-            <w:tcMar>
-              <w:top w:type="dxa" w:w="50"/>
-              <w:left w:type="dxa" w:w="80"/>
-              <w:bottom w:type="dxa" w:w="50"/>
-              <w:right w:type="dxa" w:w="80"/>
-            </w:tcMar>
-          </w:tcPr>
-          <w:p>
-            <w:pPr>
-              <w:spacing w:after="0" w:line="240"/>
-              <w:jc w:val="right"/>
-            </w:pPr>
-            <w:r>
-              <w:rPr>
-                <w:rFonts w:ascii="Calibri" w:cs="Calibri" w:eastAsia="Calibri" w:hAnsi="Calibri"/>
-                <w:sz w:val="16"/>
-                <w:szCs w:val="16"/>
-              </w:rPr>
-              <w:t xml:space="preserve">72</w:t>
-            </w:r>
-          </w:p>
-        </w:tc>
-        <w:tc>
-          <w:tcPr>
-            <w:tcW w:type="dxa" w:w="2760"/>
-            <w:tcMar>
-              <w:top w:type="dxa" w:w="50"/>
-              <w:left w:type="dxa" w:w="80"/>
-              <w:bottom w:type="dxa" w:w="50"/>
-              <w:right w:type="dxa" w:w="80"/>
-            </w:tcMar>
-          </w:tcPr>
-          <w:p>
-            <w:pPr>
-              <w:spacing w:after="0" w:line="240"/>
-              <w:jc w:val="right"/>
-            </w:pPr>
-            <w:r>
-              <w:rPr>
-                <w:rFonts w:ascii="Calibri" w:cs="Calibri" w:eastAsia="Calibri" w:hAnsi="Calibri"/>
-                <w:sz w:val="16"/>
-                <w:szCs w:val="16"/>
-              </w:rPr>
-              <w:t xml:space="preserve">60</w:t>
+              <w:t xml:space="preserve">matched on HR, band 15%</w:t>
+            </w:r>
+          </w:p>
+        </w:tc>
+        <w:tc>
+          <w:tcPr>
+            <w:tcW w:type="dxa" w:w="2900"/>
+            <w:tcMar>
+              <w:top w:type="dxa" w:w="50"/>
+              <w:left w:type="dxa" w:w="80"/>
+              <w:bottom w:type="dxa" w:w="50"/>
+              <w:right w:type="dxa" w:w="80"/>
+            </w:tcMar>
+          </w:tcPr>
+          <w:p>
+            <w:pPr>
+              <w:spacing w:after="0" w:line="240"/>
+              <w:jc w:val="right"/>
+            </w:pPr>
+            <w:r>
+              <w:rPr>
+                <w:rFonts w:ascii="Calibri" w:cs="Calibri" w:eastAsia="Calibri" w:hAnsi="Calibri"/>
+                <w:sz w:val="16"/>
+                <w:szCs w:val="16"/>
+              </w:rPr>
+              <w:t xml:space="preserve">0.558 [0.31, 0.77]</w:t>
+            </w:r>
+          </w:p>
+        </w:tc>
+        <w:tc>
+          <w:tcPr>
+            <w:tcW w:type="dxa" w:w="2860"/>
+            <w:tcMar>
+              <w:top w:type="dxa" w:w="50"/>
+              <w:left w:type="dxa" w:w="80"/>
+              <w:bottom w:type="dxa" w:w="50"/>
+              <w:right w:type="dxa" w:w="80"/>
+            </w:tcMar>
+          </w:tcPr>
+          <w:p>
+            <w:pPr>
+              <w:spacing w:after="0" w:line="240"/>
+              <w:jc w:val="right"/>
+            </w:pPr>
+            <w:r>
+              <w:rPr>
+                <w:rFonts w:ascii="Calibri" w:cs="Calibri" w:eastAsia="Calibri" w:hAnsi="Calibri"/>
+                <w:sz w:val="16"/>
+                <w:szCs w:val="16"/>
+              </w:rPr>
+              <w:t xml:space="preserve">0.511 [0.36, 0.74]</w:t>
+            </w:r>
+          </w:p>
+        </w:tc>
+      </w:tr>
+      <w:tr>
+        <w:trPr>
+          <w:cantSplit/>
+        </w:trPr>
+        <w:tc>
+          <w:tcPr>
+            <w:tcW w:type="dxa" w:w="3600"/>
+            <w:tcMar>
+              <w:top w:type="dxa" w:w="50"/>
+              <w:left w:type="dxa" w:w="80"/>
+              <w:bottom w:type="dxa" w:w="50"/>
+              <w:right w:type="dxa" w:w="80"/>
+            </w:tcMar>
+          </w:tcPr>
+          <w:p>
+            <w:pPr>
+              <w:spacing w:after="0" w:line="240"/>
+              <w:jc w:val="left"/>
+            </w:pPr>
+            <w:r>
+              <w:rPr>
+                <w:rFonts w:ascii="Calibri" w:cs="Calibri" w:eastAsia="Calibri" w:hAnsi="Calibri"/>
+                <w:sz w:val="16"/>
+                <w:szCs w:val="16"/>
+              </w:rPr>
+              <w:t xml:space="preserve">matched on RMST, band 10%</w:t>
+            </w:r>
+          </w:p>
+        </w:tc>
+        <w:tc>
+          <w:tcPr>
+            <w:tcW w:type="dxa" w:w="2900"/>
+            <w:tcMar>
+              <w:top w:type="dxa" w:w="50"/>
+              <w:left w:type="dxa" w:w="80"/>
+              <w:bottom w:type="dxa" w:w="50"/>
+              <w:right w:type="dxa" w:w="80"/>
+            </w:tcMar>
+          </w:tcPr>
+          <w:p>
+            <w:pPr>
+              <w:spacing w:after="0" w:line="240"/>
+              <w:jc w:val="right"/>
+            </w:pPr>
+            <w:r>
+              <w:rPr>
+                <w:rFonts w:ascii="Calibri" w:cs="Calibri" w:eastAsia="Calibri" w:hAnsi="Calibri"/>
+                <w:sz w:val="16"/>
+                <w:szCs w:val="16"/>
+              </w:rPr>
+              <w:t xml:space="preserve">0.452 [0.28, 0.66]</w:t>
+            </w:r>
+          </w:p>
+        </w:tc>
+        <w:tc>
+          <w:tcPr>
+            <w:tcW w:type="dxa" w:w="2860"/>
+            <w:tcMar>
+              <w:top w:type="dxa" w:w="50"/>
+              <w:left w:type="dxa" w:w="80"/>
+              <w:bottom w:type="dxa" w:w="50"/>
+              <w:right w:type="dxa" w:w="80"/>
+            </w:tcMar>
+          </w:tcPr>
+          <w:p>
+            <w:pPr>
+              <w:spacing w:after="0" w:line="240"/>
+              <w:jc w:val="right"/>
+            </w:pPr>
+            <w:r>
+              <w:rPr>
+                <w:rFonts w:ascii="Calibri" w:cs="Calibri" w:eastAsia="Calibri" w:hAnsi="Calibri"/>
+                <w:sz w:val="16"/>
+                <w:szCs w:val="16"/>
+              </w:rPr>
+              <w:t xml:space="preserve">0.506 [0.33, 0.72]</w:t>
+            </w:r>
+          </w:p>
+        </w:tc>
+      </w:tr>
+      <w:tr>
+        <w:trPr>
+          <w:cantSplit/>
+        </w:trPr>
+        <w:tc>
+          <w:tcPr>
+            <w:tcW w:type="dxa" w:w="3600"/>
+            <w:tcMar>
+              <w:top w:type="dxa" w:w="50"/>
+              <w:left w:type="dxa" w:w="80"/>
+              <w:bottom w:type="dxa" w:w="50"/>
+              <w:right w:type="dxa" w:w="80"/>
+            </w:tcMar>
+          </w:tcPr>
+          <w:p>
+            <w:pPr>
+              <w:spacing w:after="0" w:line="240"/>
+              <w:jc w:val="left"/>
+            </w:pPr>
+            <w:r>
+              <w:rPr>
+                <w:rFonts w:ascii="Calibri" w:cs="Calibri" w:eastAsia="Calibri" w:hAnsi="Calibri"/>
+                <w:sz w:val="16"/>
+                <w:szCs w:val="16"/>
+              </w:rPr>
+              <w:t xml:space="preserve">on count/HR frontier</w:t>
+            </w:r>
+          </w:p>
+        </w:tc>
+        <w:tc>
+          <w:tcPr>
+            <w:tcW w:type="dxa" w:w="2900"/>
+            <w:tcMar>
+              <w:top w:type="dxa" w:w="50"/>
+              <w:left w:type="dxa" w:w="80"/>
+              <w:bottom w:type="dxa" w:w="50"/>
+              <w:right w:type="dxa" w:w="80"/>
+            </w:tcMar>
+          </w:tcPr>
+          <w:p>
+            <w:pPr>
+              <w:spacing w:after="0" w:line="240"/>
+              <w:jc w:val="right"/>
+            </w:pPr>
+            <w:r>
+              <w:rPr>
+                <w:rFonts w:ascii="Calibri" w:cs="Calibri" w:eastAsia="Calibri" w:hAnsi="Calibri"/>
+                <w:sz w:val="16"/>
+                <w:szCs w:val="16"/>
+              </w:rPr>
+              <w:t xml:space="preserve">0.000 [0.00, 0.13]</w:t>
+            </w:r>
+          </w:p>
+        </w:tc>
+        <w:tc>
+          <w:tcPr>
+            <w:tcW w:type="dxa" w:w="2860"/>
+            <w:tcMar>
+              <w:top w:type="dxa" w:w="50"/>
+              <w:left w:type="dxa" w:w="80"/>
+              <w:bottom w:type="dxa" w:w="50"/>
+              <w:right w:type="dxa" w:w="80"/>
+            </w:tcMar>
+          </w:tcPr>
+          <w:p>
+            <w:pPr>
+              <w:spacing w:after="0" w:line="240"/>
+              <w:jc w:val="right"/>
+            </w:pPr>
+            <w:r>
+              <w:rPr>
+                <w:rFonts w:ascii="Calibri" w:cs="Calibri" w:eastAsia="Calibri" w:hAnsi="Calibri"/>
+                <w:sz w:val="16"/>
+                <w:szCs w:val="16"/>
+              </w:rPr>
+              <w:t xml:space="preserve">0.080 [0.00, 0.17]</w:t>
+            </w:r>
+          </w:p>
+        </w:tc>
+      </w:tr>
+      <w:tr>
+        <w:trPr>
+          <w:cantSplit/>
+        </w:trPr>
+        <w:tc>
+          <w:tcPr>
+            <w:tcW w:type="dxa" w:w="3600"/>
+            <w:tcMar>
+              <w:top w:type="dxa" w:w="50"/>
+              <w:left w:type="dxa" w:w="80"/>
+              <w:bottom w:type="dxa" w:w="50"/>
+              <w:right w:type="dxa" w:w="80"/>
+            </w:tcMar>
+          </w:tcPr>
+          <w:p>
+            <w:pPr>
+              <w:spacing w:after="0" w:line="240"/>
+              <w:jc w:val="left"/>
+            </w:pPr>
+            <w:r>
+              <w:rPr>
+                <w:rFonts w:ascii="Calibri" w:cs="Calibri" w:eastAsia="Calibri" w:hAnsi="Calibri"/>
+                <w:sz w:val="16"/>
+                <w:szCs w:val="16"/>
+              </w:rPr>
+              <w:t xml:space="preserve">on count/RMST frontier</w:t>
+            </w:r>
+          </w:p>
+        </w:tc>
+        <w:tc>
+          <w:tcPr>
+            <w:tcW w:type="dxa" w:w="2900"/>
+            <w:tcMar>
+              <w:top w:type="dxa" w:w="50"/>
+              <w:left w:type="dxa" w:w="80"/>
+              <w:bottom w:type="dxa" w:w="50"/>
+              <w:right w:type="dxa" w:w="80"/>
+            </w:tcMar>
+          </w:tcPr>
+          <w:p>
+            <w:pPr>
+              <w:spacing w:after="0" w:line="240"/>
+              <w:jc w:val="right"/>
+            </w:pPr>
+            <w:r>
+              <w:rPr>
+                <w:rFonts w:ascii="Calibri" w:cs="Calibri" w:eastAsia="Calibri" w:hAnsi="Calibri"/>
+                <w:sz w:val="16"/>
+                <w:szCs w:val="16"/>
+              </w:rPr>
+              <w:t xml:space="preserve">0.000 [0.00, 0.08]</w:t>
+            </w:r>
+          </w:p>
+        </w:tc>
+        <w:tc>
+          <w:tcPr>
+            <w:tcW w:type="dxa" w:w="2860"/>
+            <w:tcMar>
+              <w:top w:type="dxa" w:w="50"/>
+              <w:left w:type="dxa" w:w="80"/>
+              <w:bottom w:type="dxa" w:w="50"/>
+              <w:right w:type="dxa" w:w="80"/>
+            </w:tcMar>
+          </w:tcPr>
+          <w:p>
+            <w:pPr>
+              <w:spacing w:after="0" w:line="240"/>
+              <w:jc w:val="right"/>
+            </w:pPr>
+            <w:r>
+              <w:rPr>
+                <w:rFonts w:ascii="Calibri" w:cs="Calibri" w:eastAsia="Calibri" w:hAnsi="Calibri"/>
+                <w:sz w:val="16"/>
+                <w:szCs w:val="16"/>
+              </w:rPr>
+              <w:t xml:space="preserve">0.160 [0.00, 0.17]</w:t>
+            </w:r>
+          </w:p>
+        </w:tc>
+      </w:tr>
+      <w:tr>
+        <w:trPr>
+          <w:cantSplit/>
+        </w:trPr>
+        <w:tc>
+          <w:tcPr>
+            <w:tcW w:type="dxa" w:w="3600"/>
+            <w:tcMar>
+              <w:top w:type="dxa" w:w="50"/>
+              <w:left w:type="dxa" w:w="80"/>
+              <w:bottom w:type="dxa" w:w="50"/>
+              <w:right w:type="dxa" w:w="80"/>
+            </w:tcMar>
+          </w:tcPr>
+          <w:p>
+            <w:pPr>
+              <w:spacing w:after="0" w:line="240"/>
+              <w:jc w:val="left"/>
+            </w:pPr>
+            <w:r>
+              <w:rPr>
+                <w:rFonts w:ascii="Calibri" w:cs="Calibri" w:eastAsia="Calibri" w:hAnsi="Calibri"/>
+                <w:sz w:val="16"/>
+                <w:szCs w:val="16"/>
+              </w:rPr>
+              <w:t xml:space="preserve">on frontier with margin 0.05</w:t>
+            </w:r>
+          </w:p>
+        </w:tc>
+        <w:tc>
+          <w:tcPr>
+            <w:tcW w:type="dxa" w:w="2900"/>
+            <w:tcMar>
+              <w:top w:type="dxa" w:w="50"/>
+              <w:left w:type="dxa" w:w="80"/>
+              <w:bottom w:type="dxa" w:w="50"/>
+              <w:right w:type="dxa" w:w="80"/>
+            </w:tcMar>
+          </w:tcPr>
+          <w:p>
+            <w:pPr>
+              <w:spacing w:after="0" w:line="240"/>
+              <w:jc w:val="right"/>
+            </w:pPr>
+            <w:r>
+              <w:rPr>
+                <w:rFonts w:ascii="Calibri" w:cs="Calibri" w:eastAsia="Calibri" w:hAnsi="Calibri"/>
+                <w:sz w:val="16"/>
+                <w:szCs w:val="16"/>
+              </w:rPr>
+              <w:t xml:space="preserve">0.000 [0.00, 0.21]</w:t>
+            </w:r>
+          </w:p>
+        </w:tc>
+        <w:tc>
+          <w:tcPr>
+            <w:tcW w:type="dxa" w:w="2860"/>
+            <w:tcMar>
+              <w:top w:type="dxa" w:w="50"/>
+              <w:left w:type="dxa" w:w="80"/>
+              <w:bottom w:type="dxa" w:w="50"/>
+              <w:right w:type="dxa" w:w="80"/>
+            </w:tcMar>
+          </w:tcPr>
+          <w:p>
+            <w:pPr>
+              <w:spacing w:after="0" w:line="240"/>
+              <w:jc w:val="right"/>
+            </w:pPr>
+            <w:r>
+              <w:rPr>
+                <w:rFonts w:ascii="Calibri" w:cs="Calibri" w:eastAsia="Calibri" w:hAnsi="Calibri"/>
+                <w:sz w:val="16"/>
+                <w:szCs w:val="16"/>
+              </w:rPr>
+              <w:t xml:space="preserve">0.120 [0.00, 0.32]</w:t>
+            </w:r>
+          </w:p>
+        </w:tc>
+      </w:tr>
+      <w:tr>
+        <w:trPr>
+          <w:cantSplit/>
+        </w:trPr>
+        <w:tc>
+          <w:tcPr>
+            <w:tcW w:type="dxa" w:w="3600"/>
+            <w:tcMar>
+              <w:top w:type="dxa" w:w="50"/>
+              <w:left w:type="dxa" w:w="80"/>
+              <w:bottom w:type="dxa" w:w="50"/>
+              <w:right w:type="dxa" w:w="80"/>
+            </w:tcMar>
+          </w:tcPr>
+          <w:p>
+            <w:pPr>
+              <w:spacing w:after="0" w:line="240"/>
+              <w:jc w:val="left"/>
+            </w:pPr>
+            <w:r>
+              <w:rPr>
+                <w:rFonts w:ascii="Calibri" w:cs="Calibri" w:eastAsia="Calibri" w:hAnsi="Calibri"/>
+                <w:sz w:val="16"/>
+                <w:szCs w:val="16"/>
+              </w:rPr>
+              <w:t xml:space="preserve">matched comparators per split (median)</w:t>
+            </w:r>
+          </w:p>
+        </w:tc>
+        <w:tc>
+          <w:tcPr>
+            <w:tcW w:type="dxa" w:w="2900"/>
+            <w:tcMar>
+              <w:top w:type="dxa" w:w="50"/>
+              <w:left w:type="dxa" w:w="80"/>
+              <w:bottom w:type="dxa" w:w="50"/>
+              <w:right w:type="dxa" w:w="80"/>
+            </w:tcMar>
+          </w:tcPr>
+          <w:p>
+            <w:pPr>
+              <w:spacing w:after="0" w:line="240"/>
+              <w:jc w:val="right"/>
+            </w:pPr>
+            <w:r>
+              <w:rPr>
+                <w:rFonts w:ascii="Calibri" w:cs="Calibri" w:eastAsia="Calibri" w:hAnsi="Calibri"/>
+                <w:sz w:val="16"/>
+                <w:szCs w:val="16"/>
+              </w:rPr>
+              <w:t xml:space="preserve">112</w:t>
+            </w:r>
+          </w:p>
+        </w:tc>
+        <w:tc>
+          <w:tcPr>
+            <w:tcW w:type="dxa" w:w="2860"/>
+            <w:tcMar>
+              <w:top w:type="dxa" w:w="50"/>
+              <w:left w:type="dxa" w:w="80"/>
+              <w:bottom w:type="dxa" w:w="50"/>
+              <w:right w:type="dxa" w:w="80"/>
+            </w:tcMar>
+          </w:tcPr>
+          <w:p>
+            <w:pPr>
+              <w:spacing w:after="0" w:line="240"/>
+              <w:jc w:val="right"/>
+            </w:pPr>
+            <w:r>
+              <w:rPr>
+                <w:rFonts w:ascii="Calibri" w:cs="Calibri" w:eastAsia="Calibri" w:hAnsi="Calibri"/>
+                <w:sz w:val="16"/>
+                <w:szCs w:val="16"/>
+              </w:rPr>
+              <w:t xml:space="preserve">66</w:t>
+            </w:r>
+          </w:p>
+        </w:tc>
+      </w:tr>
+      <w:tr>
+        <w:trPr>
+          <w:cantSplit/>
+        </w:trPr>
+        <w:tc>
+          <w:tcPr>
+            <w:tcW w:type="dxa" w:w="3600"/>
+            <w:tcMar>
+              <w:top w:type="dxa" w:w="50"/>
+              <w:left w:type="dxa" w:w="80"/>
+              <w:bottom w:type="dxa" w:w="50"/>
+              <w:right w:type="dxa" w:w="80"/>
+            </w:tcMar>
+          </w:tcPr>
+          <w:p>
+            <w:pPr>
+              <w:spacing w:after="0" w:line="240"/>
+              <w:jc w:val="left"/>
+            </w:pPr>
+            <w:r>
+              <w:rPr>
+                <w:rFonts w:ascii="Calibri" w:cs="Calibri" w:eastAsia="Calibri" w:hAnsi="Calibri"/>
+                <w:sz w:val="16"/>
+                <w:szCs w:val="16"/>
+              </w:rPr>
+              <w:t xml:space="preserve">comparator count skew vs rule</w:t>
+            </w:r>
+          </w:p>
+        </w:tc>
+        <w:tc>
+          <w:tcPr>
+            <w:tcW w:type="dxa" w:w="2900"/>
+            <w:tcMar>
+              <w:top w:type="dxa" w:w="50"/>
+              <w:left w:type="dxa" w:w="80"/>
+              <w:bottom w:type="dxa" w:w="50"/>
+              <w:right w:type="dxa" w:w="80"/>
+            </w:tcMar>
+          </w:tcPr>
+          <w:p>
+            <w:pPr>
+              <w:spacing w:after="0" w:line="240"/>
+              <w:jc w:val="right"/>
+            </w:pPr>
+            <w:r>
+              <w:rPr>
+                <w:rFonts w:ascii="Calibri" w:cs="Calibri" w:eastAsia="Calibri" w:hAnsi="Calibri"/>
+                <w:sz w:val="16"/>
+                <w:szCs w:val="16"/>
+              </w:rPr>
+              <w:t xml:space="preserve">0.000</w:t>
+            </w:r>
+          </w:p>
+        </w:tc>
+        <w:tc>
+          <w:tcPr>
+            <w:tcW w:type="dxa" w:w="2860"/>
+            <w:tcMar>
+              <w:top w:type="dxa" w:w="50"/>
+              <w:left w:type="dxa" w:w="80"/>
+              <w:bottom w:type="dxa" w:w="50"/>
+              <w:right w:type="dxa" w:w="80"/>
+            </w:tcMar>
+          </w:tcPr>
+          <w:p>
+            <w:pPr>
+              <w:spacing w:after="0" w:line="240"/>
+              <w:jc w:val="right"/>
+            </w:pPr>
+            <w:r>
+              <w:rPr>
+                <w:rFonts w:ascii="Calibri" w:cs="Calibri" w:eastAsia="Calibri" w:hAnsi="Calibri"/>
+                <w:sz w:val="16"/>
+                <w:szCs w:val="16"/>
+              </w:rPr>
+              <w:t xml:space="preserve">-0.005</w:t>
+            </w:r>
+          </w:p>
+        </w:tc>
+      </w:tr>
+      <w:tr>
+        <w:trPr>
+          <w:cantSplit/>
+        </w:trPr>
+        <w:tc>
+          <w:tcPr>
+            <w:tcW w:type="dxa" w:w="3600"/>
+            <w:tcMar>
+              <w:top w:type="dxa" w:w="50"/>
+              <w:left w:type="dxa" w:w="80"/>
+              <w:bottom w:type="dxa" w:w="50"/>
+              <w:right w:type="dxa" w:w="80"/>
+            </w:tcMar>
+          </w:tcPr>
+          <w:p>
+            <w:pPr>
+              <w:spacing w:after="0" w:line="240"/>
+              <w:jc w:val="left"/>
+            </w:pPr>
+            <w:r>
+              <w:rPr>
+                <w:rFonts w:ascii="Calibri" w:cs="Calibri" w:eastAsia="Calibri" w:hAnsi="Calibri"/>
+                <w:sz w:val="16"/>
+                <w:szCs w:val="16"/>
+              </w:rPr>
+              <w:t xml:space="preserve">subsets dominating (median)</w:t>
+            </w:r>
+          </w:p>
+        </w:tc>
+        <w:tc>
+          <w:tcPr>
+            <w:tcW w:type="dxa" w:w="2900"/>
+            <w:tcMar>
+              <w:top w:type="dxa" w:w="50"/>
+              <w:left w:type="dxa" w:w="80"/>
+              <w:bottom w:type="dxa" w:w="50"/>
+              <w:right w:type="dxa" w:w="80"/>
+            </w:tcMar>
+          </w:tcPr>
+          <w:p>
+            <w:pPr>
+              <w:spacing w:after="0" w:line="240"/>
+              <w:jc w:val="right"/>
+            </w:pPr>
+            <w:r>
+              <w:rPr>
+                <w:rFonts w:ascii="Calibri" w:cs="Calibri" w:eastAsia="Calibri" w:hAnsi="Calibri"/>
+                <w:sz w:val="16"/>
+                <w:szCs w:val="16"/>
+              </w:rPr>
+              <w:t xml:space="preserve">133</w:t>
+            </w:r>
+          </w:p>
+        </w:tc>
+        <w:tc>
+          <w:tcPr>
+            <w:tcW w:type="dxa" w:w="2860"/>
+            <w:tcMar>
+              <w:top w:type="dxa" w:w="50"/>
+              <w:left w:type="dxa" w:w="80"/>
+              <w:bottom w:type="dxa" w:w="50"/>
+              <w:right w:type="dxa" w:w="80"/>
+            </w:tcMar>
+          </w:tcPr>
+          <w:p>
+            <w:pPr>
+              <w:spacing w:after="0" w:line="240"/>
+              <w:jc w:val="right"/>
+            </w:pPr>
+            <w:r>
+              <w:rPr>
+                <w:rFonts w:ascii="Calibri" w:cs="Calibri" w:eastAsia="Calibri" w:hAnsi="Calibri"/>
+                <w:sz w:val="16"/>
+                <w:szCs w:val="16"/>
+              </w:rPr>
+              <w:t xml:space="preserve">96</w:t>
             </w:r>
           </w:p>
         </w:tc>
@@ -15556,7 +16116,34 @@
     </w:tbl>
     <w:p>
       <w:pPr>
-        <w:spacing w:after="200" w:line="280"/>
+        <w:spacing w:after="240" w:line="280"/>
+        <w:jc w:val="both"/>
+      </w:pPr>
+      <w:r>
+        <w:rPr>
+          <w:rFonts w:ascii="Calibri" w:cs="Calibri" w:eastAsia="Calibri" w:hAnsi="Calibri"/>
+          <w:color w:val="555555"/>
+          <w:sz w:val="17"/>
+          <w:szCs w:val="17"/>
+        </w:rPr>
+        <w:t xml:space="preserve">Point estimates are from the observed cohort; SD is decomposed as SD_outer = sqrt(SD_total^2 - SD_MC^2) in the main text. Intervals are percentile intervals of the outer distribution and are exploratory at these resample counts.</w:t>
+      </w:r>
+    </w:p>
+    <w:p>
+      <w:pPr>
+        <w:pStyle w:val="Heading1"/>
+        <w:spacing w:after="140" w:before="300"/>
+      </w:pPr>
+      <w:r>
+        <w:rPr>
+          <w:rFonts w:ascii="Calibri" w:cs="Calibri" w:eastAsia="Calibri" w:hAnsi="Calibri"/>
+        </w:rPr>
+        <w:t xml:space="preserve">Table S3b. Optimism of the empirical held-out frontier</w:t>
+      </w:r>
+    </w:p>
+    <w:p>
+      <w:pPr>
+        <w:spacing w:after="120" w:line="280"/>
         <w:jc w:val="both"/>
       </w:pPr>
       <w:r>
@@ -15565,7 +16152,1239 @@
           <w:sz w:val="20"/>
           <w:szCs w:val="20"/>
         </w:rPr>
-        <w:t xml:space="preserve"/>
+        <w:t xml:space="preserve">The frontier is selected from the same held-out data on which it is evaluated, so it is an argmax over 512 noisy estimates. In simulation the population is known and the optimism can be measured directly, at a held-out half the size of a colon scoring set.</w:t>
+      </w:r>
+    </w:p>
+    <w:tbl>
+      <w:tblPr>
+        <w:tblW w:type="dxa" w:w="9360"/>
+        <w:tblBorders>
+          <w:top w:val="single" w:color="9AA4AF" w:sz="6"/>
+          <w:left w:val="none"/>
+          <w:bottom w:val="single" w:color="9AA4AF" w:sz="6"/>
+          <w:right w:val="none"/>
+          <w:insideH w:val="single" w:color="D7DEE5" w:sz="2"/>
+          <w:insideV w:val="none"/>
+        </w:tblBorders>
+      </w:tblPr>
+      <w:tblGrid>
+        <w:gridCol w:w="4600"/>
+        <w:gridCol w:w="2400"/>
+        <w:gridCol w:w="2360"/>
+      </w:tblGrid>
+      <w:tr>
+        <w:trPr>
+          <w:cantSplit/>
+          <w:tblHeader/>
+        </w:trPr>
+        <w:tc>
+          <w:tcPr>
+            <w:tcW w:type="dxa" w:w="4600"/>
+            <w:shd w:fill="EDF1F5" w:val="clear"/>
+            <w:tcMar>
+              <w:top w:type="dxa" w:w="50"/>
+              <w:left w:type="dxa" w:w="80"/>
+              <w:bottom w:type="dxa" w:w="50"/>
+              <w:right w:type="dxa" w:w="80"/>
+            </w:tcMar>
+          </w:tcPr>
+          <w:p>
+            <w:pPr>
+              <w:spacing w:after="0" w:line="240"/>
+              <w:jc w:val="left"/>
+            </w:pPr>
+            <w:r>
+              <w:rPr>
+                <w:rFonts w:ascii="Calibri" w:cs="Calibri" w:eastAsia="Calibri" w:hAnsi="Calibri"/>
+                <w:b/>
+                <w:bCs/>
+                <w:sz w:val="16"/>
+                <w:szCs w:val="16"/>
+              </w:rPr>
+              <w:t xml:space="preserve">quantity</w:t>
+            </w:r>
+          </w:p>
+        </w:tc>
+        <w:tc>
+          <w:tcPr>
+            <w:tcW w:type="dxa" w:w="2400"/>
+            <w:shd w:fill="EDF1F5" w:val="clear"/>
+            <w:tcMar>
+              <w:top w:type="dxa" w:w="50"/>
+              <w:left w:type="dxa" w:w="80"/>
+              <w:bottom w:type="dxa" w:w="50"/>
+              <w:right w:type="dxa" w:w="80"/>
+            </w:tcMar>
+          </w:tcPr>
+          <w:p>
+            <w:pPr>
+              <w:spacing w:after="0" w:line="240"/>
+              <w:jc w:val="right"/>
+            </w:pPr>
+            <w:r>
+              <w:rPr>
+                <w:rFonts w:ascii="Calibri" w:cs="Calibri" w:eastAsia="Calibri" w:hAnsi="Calibri"/>
+                <w:b/>
+                <w:bCs/>
+                <w:sz w:val="16"/>
+                <w:szCs w:val="16"/>
+              </w:rPr>
+              <w:t xml:space="preserve">judged on a held-out half</w:t>
+            </w:r>
+          </w:p>
+        </w:tc>
+        <w:tc>
+          <w:tcPr>
+            <w:tcW w:type="dxa" w:w="2360"/>
+            <w:shd w:fill="EDF1F5" w:val="clear"/>
+            <w:tcMar>
+              <w:top w:type="dxa" w:w="50"/>
+              <w:left w:type="dxa" w:w="80"/>
+              <w:bottom w:type="dxa" w:w="50"/>
+              <w:right w:type="dxa" w:w="80"/>
+            </w:tcMar>
+          </w:tcPr>
+          <w:p>
+            <w:pPr>
+              <w:spacing w:after="0" w:line="240"/>
+              <w:jc w:val="right"/>
+            </w:pPr>
+            <w:r>
+              <w:rPr>
+                <w:rFonts w:ascii="Calibri" w:cs="Calibri" w:eastAsia="Calibri" w:hAnsi="Calibri"/>
+                <w:b/>
+                <w:bCs/>
+                <w:sz w:val="16"/>
+                <w:szCs w:val="16"/>
+              </w:rPr>
+              <w:t xml:space="preserve">judged at the population</w:t>
+            </w:r>
+          </w:p>
+        </w:tc>
+      </w:tr>
+      <w:tr>
+        <w:trPr>
+          <w:cantSplit/>
+        </w:trPr>
+        <w:tc>
+          <w:tcPr>
+            <w:tcW w:type="dxa" w:w="4600"/>
+            <w:tcMar>
+              <w:top w:type="dxa" w:w="50"/>
+              <w:left w:type="dxa" w:w="80"/>
+              <w:bottom w:type="dxa" w:w="50"/>
+              <w:right w:type="dxa" w:w="80"/>
+            </w:tcMar>
+          </w:tcPr>
+          <w:p>
+            <w:pPr>
+              <w:spacing w:after="0" w:line="240"/>
+              <w:jc w:val="left"/>
+            </w:pPr>
+            <w:r>
+              <w:rPr>
+                <w:rFonts w:ascii="Calibri" w:cs="Calibri" w:eastAsia="Calibri" w:hAnsi="Calibri"/>
+                <w:sz w:val="16"/>
+                <w:szCs w:val="16"/>
+              </w:rPr>
+              <w:t xml:space="preserve">subsets dominating the rule (median)</w:t>
+            </w:r>
+          </w:p>
+        </w:tc>
+        <w:tc>
+          <w:tcPr>
+            <w:tcW w:type="dxa" w:w="2400"/>
+            <w:tcMar>
+              <w:top w:type="dxa" w:w="50"/>
+              <w:left w:type="dxa" w:w="80"/>
+              <w:bottom w:type="dxa" w:w="50"/>
+              <w:right w:type="dxa" w:w="80"/>
+            </w:tcMar>
+          </w:tcPr>
+          <w:p>
+            <w:pPr>
+              <w:spacing w:after="0" w:line="240"/>
+              <w:jc w:val="right"/>
+            </w:pPr>
+            <w:r>
+              <w:rPr>
+                <w:rFonts w:ascii="Calibri" w:cs="Calibri" w:eastAsia="Calibri" w:hAnsi="Calibri"/>
+                <w:sz w:val="16"/>
+                <w:szCs w:val="16"/>
+              </w:rPr>
+              <w:t xml:space="preserve">73</w:t>
+            </w:r>
+          </w:p>
+        </w:tc>
+        <w:tc>
+          <w:tcPr>
+            <w:tcW w:type="dxa" w:w="2360"/>
+            <w:tcMar>
+              <w:top w:type="dxa" w:w="50"/>
+              <w:left w:type="dxa" w:w="80"/>
+              <w:bottom w:type="dxa" w:w="50"/>
+              <w:right w:type="dxa" w:w="80"/>
+            </w:tcMar>
+          </w:tcPr>
+          <w:p>
+            <w:pPr>
+              <w:spacing w:after="0" w:line="240"/>
+              <w:jc w:val="right"/>
+            </w:pPr>
+            <w:r>
+              <w:rPr>
+                <w:rFonts w:ascii="Calibri" w:cs="Calibri" w:eastAsia="Calibri" w:hAnsi="Calibri"/>
+                <w:sz w:val="16"/>
+                <w:szCs w:val="16"/>
+              </w:rPr>
+              <w:t xml:space="preserve">31</w:t>
+            </w:r>
+          </w:p>
+        </w:tc>
+      </w:tr>
+      <w:tr>
+        <w:trPr>
+          <w:cantSplit/>
+        </w:trPr>
+        <w:tc>
+          <w:tcPr>
+            <w:tcW w:type="dxa" w:w="4600"/>
+            <w:tcMar>
+              <w:top w:type="dxa" w:w="50"/>
+              <w:left w:type="dxa" w:w="80"/>
+              <w:bottom w:type="dxa" w:w="50"/>
+              <w:right w:type="dxa" w:w="80"/>
+            </w:tcMar>
+          </w:tcPr>
+          <w:p>
+            <w:pPr>
+              <w:spacing w:after="0" w:line="240"/>
+              <w:jc w:val="left"/>
+            </w:pPr>
+            <w:r>
+              <w:rPr>
+                <w:rFonts w:ascii="Calibri" w:cs="Calibri" w:eastAsia="Calibri" w:hAnsi="Calibri"/>
+                <w:sz w:val="16"/>
+                <w:szCs w:val="16"/>
+              </w:rPr>
+              <w:t xml:space="preserve">rule on the frontier</w:t>
+            </w:r>
+          </w:p>
+        </w:tc>
+        <w:tc>
+          <w:tcPr>
+            <w:tcW w:type="dxa" w:w="2400"/>
+            <w:tcMar>
+              <w:top w:type="dxa" w:w="50"/>
+              <w:left w:type="dxa" w:w="80"/>
+              <w:bottom w:type="dxa" w:w="50"/>
+              <w:right w:type="dxa" w:w="80"/>
+            </w:tcMar>
+          </w:tcPr>
+          <w:p>
+            <w:pPr>
+              <w:spacing w:after="0" w:line="240"/>
+              <w:jc w:val="right"/>
+            </w:pPr>
+            <w:r>
+              <w:rPr>
+                <w:rFonts w:ascii="Calibri" w:cs="Calibri" w:eastAsia="Calibri" w:hAnsi="Calibri"/>
+                <w:sz w:val="16"/>
+                <w:szCs w:val="16"/>
+              </w:rPr>
+              <w:t xml:space="preserve">0.056</w:t>
+            </w:r>
+          </w:p>
+        </w:tc>
+        <w:tc>
+          <w:tcPr>
+            <w:tcW w:type="dxa" w:w="2360"/>
+            <w:tcMar>
+              <w:top w:type="dxa" w:w="50"/>
+              <w:left w:type="dxa" w:w="80"/>
+              <w:bottom w:type="dxa" w:w="50"/>
+              <w:right w:type="dxa" w:w="80"/>
+            </w:tcMar>
+          </w:tcPr>
+          <w:p>
+            <w:pPr>
+              <w:spacing w:after="0" w:line="240"/>
+              <w:jc w:val="right"/>
+            </w:pPr>
+            <w:r>
+              <w:rPr>
+                <w:rFonts w:ascii="Calibri" w:cs="Calibri" w:eastAsia="Calibri" w:hAnsi="Calibri"/>
+                <w:sz w:val="16"/>
+                <w:szCs w:val="16"/>
+              </w:rPr>
+              <w:t xml:space="preserve">0.106</w:t>
+            </w:r>
+          </w:p>
+        </w:tc>
+      </w:tr>
+      <w:tr>
+        <w:trPr>
+          <w:cantSplit/>
+        </w:trPr>
+        <w:tc>
+          <w:tcPr>
+            <w:tcW w:type="dxa" w:w="4600"/>
+            <w:tcMar>
+              <w:top w:type="dxa" w:w="50"/>
+              <w:left w:type="dxa" w:w="80"/>
+              <w:bottom w:type="dxa" w:w="50"/>
+              <w:right w:type="dxa" w:w="80"/>
+            </w:tcMar>
+          </w:tcPr>
+          <w:p>
+            <w:pPr>
+              <w:spacing w:after="0" w:line="240"/>
+              <w:jc w:val="left"/>
+            </w:pPr>
+            <w:r>
+              <w:rPr>
+                <w:rFonts w:ascii="Calibri" w:cs="Calibri" w:eastAsia="Calibri" w:hAnsi="Calibri"/>
+                <w:sz w:val="16"/>
+                <w:szCs w:val="16"/>
+              </w:rPr>
+              <w:t xml:space="preserve">of subsets dominating on half A, share still dominating on an independent half B</w:t>
+            </w:r>
+          </w:p>
+        </w:tc>
+        <w:tc>
+          <w:tcPr>
+            <w:tcW w:type="dxa" w:w="2400"/>
+            <w:tcMar>
+              <w:top w:type="dxa" w:w="50"/>
+              <w:left w:type="dxa" w:w="80"/>
+              <w:bottom w:type="dxa" w:w="50"/>
+              <w:right w:type="dxa" w:w="80"/>
+            </w:tcMar>
+          </w:tcPr>
+          <w:p>
+            <w:pPr>
+              <w:spacing w:after="0" w:line="240"/>
+              <w:jc w:val="right"/>
+            </w:pPr>
+            <w:r>
+              <w:rPr>
+                <w:rFonts w:ascii="Calibri" w:cs="Calibri" w:eastAsia="Calibri" w:hAnsi="Calibri"/>
+                <w:sz w:val="16"/>
+                <w:szCs w:val="16"/>
+              </w:rPr>
+              <w:t xml:space="preserve">0.376</w:t>
+            </w:r>
+          </w:p>
+        </w:tc>
+        <w:tc>
+          <w:tcPr>
+            <w:tcW w:type="dxa" w:w="2360"/>
+            <w:tcMar>
+              <w:top w:type="dxa" w:w="50"/>
+              <w:left w:type="dxa" w:w="80"/>
+              <w:bottom w:type="dxa" w:w="50"/>
+              <w:right w:type="dxa" w:w="80"/>
+            </w:tcMar>
+          </w:tcPr>
+          <w:p>
+            <w:pPr>
+              <w:spacing w:after="0" w:line="240"/>
+              <w:jc w:val="right"/>
+            </w:pPr>
+            <w:r>
+              <w:rPr>
+                <w:rFonts w:ascii="Calibri" w:cs="Calibri" w:eastAsia="Calibri" w:hAnsi="Calibri"/>
+                <w:sz w:val="16"/>
+                <w:szCs w:val="16"/>
+              </w:rPr>
+              <w:t xml:space="preserve">—</w:t>
+            </w:r>
+          </w:p>
+        </w:tc>
+      </w:tr>
+      <w:tr>
+        <w:trPr>
+          <w:cantSplit/>
+        </w:trPr>
+        <w:tc>
+          <w:tcPr>
+            <w:tcW w:type="dxa" w:w="4600"/>
+            <w:tcMar>
+              <w:top w:type="dxa" w:w="50"/>
+              <w:left w:type="dxa" w:w="80"/>
+              <w:bottom w:type="dxa" w:w="50"/>
+              <w:right w:type="dxa" w:w="80"/>
+            </w:tcMar>
+          </w:tcPr>
+          <w:p>
+            <w:pPr>
+              <w:spacing w:after="0" w:line="240"/>
+              <w:jc w:val="left"/>
+            </w:pPr>
+            <w:r>
+              <w:rPr>
+                <w:rFonts w:ascii="Calibri" w:cs="Calibri" w:eastAsia="Calibri" w:hAnsi="Calibri"/>
+                <w:sz w:val="16"/>
+                <w:szCs w:val="16"/>
+              </w:rPr>
+              <w:t xml:space="preserve">of subsets dominating on half A, share genuinely dominating at the population</w:t>
+            </w:r>
+          </w:p>
+        </w:tc>
+        <w:tc>
+          <w:tcPr>
+            <w:tcW w:type="dxa" w:w="2400"/>
+            <w:tcMar>
+              <w:top w:type="dxa" w:w="50"/>
+              <w:left w:type="dxa" w:w="80"/>
+              <w:bottom w:type="dxa" w:w="50"/>
+              <w:right w:type="dxa" w:w="80"/>
+            </w:tcMar>
+          </w:tcPr>
+          <w:p>
+            <w:pPr>
+              <w:spacing w:after="0" w:line="240"/>
+              <w:jc w:val="right"/>
+            </w:pPr>
+            <w:r>
+              <w:rPr>
+                <w:rFonts w:ascii="Calibri" w:cs="Calibri" w:eastAsia="Calibri" w:hAnsi="Calibri"/>
+                <w:sz w:val="16"/>
+                <w:szCs w:val="16"/>
+              </w:rPr>
+              <w:t xml:space="preserve">—</w:t>
+            </w:r>
+          </w:p>
+        </w:tc>
+        <w:tc>
+          <w:tcPr>
+            <w:tcW w:type="dxa" w:w="2360"/>
+            <w:tcMar>
+              <w:top w:type="dxa" w:w="50"/>
+              <w:left w:type="dxa" w:w="80"/>
+              <w:bottom w:type="dxa" w:w="50"/>
+              <w:right w:type="dxa" w:w="80"/>
+            </w:tcMar>
+          </w:tcPr>
+          <w:p>
+            <w:pPr>
+              <w:spacing w:after="0" w:line="240"/>
+              <w:jc w:val="right"/>
+            </w:pPr>
+            <w:r>
+              <w:rPr>
+                <w:rFonts w:ascii="Calibri" w:cs="Calibri" w:eastAsia="Calibri" w:hAnsi="Calibri"/>
+                <w:sz w:val="16"/>
+                <w:szCs w:val="16"/>
+              </w:rPr>
+              <w:t xml:space="preserve">0.195</w:t>
+            </w:r>
+          </w:p>
+        </w:tc>
+      </w:tr>
+    </w:tbl>
+    <w:p>
+      <w:pPr>
+        <w:spacing w:after="240" w:line="280"/>
+        <w:jc w:val="both"/>
+      </w:pPr>
+      <w:r>
+        <w:rPr>
+          <w:rFonts w:ascii="Calibri" w:cs="Calibri" w:eastAsia="Calibri" w:hAnsi="Calibri"/>
+          <w:color w:val="555555"/>
+          <w:sz w:val="17"/>
+          <w:szCs w:val="17"/>
+        </w:rPr>
+        <w:t xml:space="preserve">Roughly four in five apparently dominating subsets do not dominate at the population, and the empirical frontier understates the rule's true frontier membership by about a factor of two.</w:t>
+      </w:r>
+    </w:p>
+    <w:p>
+      <w:pPr>
+        <w:pStyle w:val="Heading1"/>
+        <w:spacing w:after="140" w:before="300"/>
+      </w:pPr>
+      <w:r>
+        <w:rPr>
+          <w:rFonts w:ascii="Calibri" w:cs="Calibri" w:eastAsia="Calibri" w:hAnsi="Calibri"/>
+        </w:rPr>
+        <w:t xml:space="preserve">Table S3c. Selecting on the absolute-benefit estimand instead</w:t>
+      </w:r>
+    </w:p>
+    <w:p>
+      <w:pPr>
+        <w:spacing w:after="120" w:line="280"/>
+        <w:jc w:val="both"/>
+      </w:pPr>
+      <w:r>
+        <w:rPr>
+          <w:rFonts w:ascii="Calibri" w:cs="Calibri" w:eastAsia="Calibri" w:hAnsi="Calibri"/>
+          <w:sz w:val="20"/>
+          <w:szCs w:val="20"/>
+        </w:rPr>
+        <w:t xml:space="preserve">The published rule decomposes the log hazard ratio. This variant retains every criterion whose Shapley value on the restricted mean difference is positive, and is scored out of sample on both estimands.</w:t>
+      </w:r>
+    </w:p>
+    <w:tbl>
+      <w:tblPr>
+        <w:tblW w:type="dxa" w:w="9360"/>
+        <w:tblBorders>
+          <w:top w:val="single" w:color="9AA4AF" w:sz="6"/>
+          <w:left w:val="none"/>
+          <w:bottom w:val="single" w:color="9AA4AF" w:sz="6"/>
+          <w:right w:val="none"/>
+          <w:insideH w:val="single" w:color="D7DEE5" w:sz="2"/>
+          <w:insideV w:val="none"/>
+        </w:tblBorders>
+      </w:tblPr>
+      <w:tblGrid>
+        <w:gridCol w:w="4200"/>
+        <w:gridCol w:w="2600"/>
+        <w:gridCol w:w="2560"/>
+      </w:tblGrid>
+      <w:tr>
+        <w:trPr>
+          <w:cantSplit/>
+          <w:tblHeader/>
+        </w:trPr>
+        <w:tc>
+          <w:tcPr>
+            <w:tcW w:type="dxa" w:w="4200"/>
+            <w:shd w:fill="EDF1F5" w:val="clear"/>
+            <w:tcMar>
+              <w:top w:type="dxa" w:w="50"/>
+              <w:left w:type="dxa" w:w="80"/>
+              <w:bottom w:type="dxa" w:w="50"/>
+              <w:right w:type="dxa" w:w="80"/>
+            </w:tcMar>
+          </w:tcPr>
+          <w:p>
+            <w:pPr>
+              <w:spacing w:after="0" w:line="240"/>
+              <w:jc w:val="left"/>
+            </w:pPr>
+            <w:r>
+              <w:rPr>
+                <w:rFonts w:ascii="Calibri" w:cs="Calibri" w:eastAsia="Calibri" w:hAnsi="Calibri"/>
+                <w:b/>
+                <w:bCs/>
+                <w:sz w:val="16"/>
+                <w:szCs w:val="16"/>
+              </w:rPr>
+              <w:t xml:space="preserve">quantity</w:t>
+            </w:r>
+          </w:p>
+        </w:tc>
+        <w:tc>
+          <w:tcPr>
+            <w:tcW w:type="dxa" w:w="2600"/>
+            <w:shd w:fill="EDF1F5" w:val="clear"/>
+            <w:tcMar>
+              <w:top w:type="dxa" w:w="50"/>
+              <w:left w:type="dxa" w:w="80"/>
+              <w:bottom w:type="dxa" w:w="50"/>
+              <w:right w:type="dxa" w:w="80"/>
+            </w:tcMar>
+          </w:tcPr>
+          <w:p>
+            <w:pPr>
+              <w:spacing w:after="0" w:line="240"/>
+              <w:jc w:val="right"/>
+            </w:pPr>
+            <w:r>
+              <w:rPr>
+                <w:rFonts w:ascii="Calibri" w:cs="Calibri" w:eastAsia="Calibri" w:hAnsi="Calibri"/>
+                <w:b/>
+                <w:bCs/>
+                <w:sz w:val="16"/>
+                <w:szCs w:val="16"/>
+              </w:rPr>
+              <w:t xml:space="preserve">colon</w:t>
+            </w:r>
+          </w:p>
+        </w:tc>
+        <w:tc>
+          <w:tcPr>
+            <w:tcW w:type="dxa" w:w="2560"/>
+            <w:shd w:fill="EDF1F5" w:val="clear"/>
+            <w:tcMar>
+              <w:top w:type="dxa" w:w="50"/>
+              <w:left w:type="dxa" w:w="80"/>
+              <w:bottom w:type="dxa" w:w="50"/>
+              <w:right w:type="dxa" w:w="80"/>
+            </w:tcMar>
+          </w:tcPr>
+          <w:p>
+            <w:pPr>
+              <w:spacing w:after="0" w:line="240"/>
+              <w:jc w:val="right"/>
+            </w:pPr>
+            <w:r>
+              <w:rPr>
+                <w:rFonts w:ascii="Calibri" w:cs="Calibri" w:eastAsia="Calibri" w:hAnsi="Calibri"/>
+                <w:b/>
+                <w:bCs/>
+                <w:sz w:val="16"/>
+                <w:szCs w:val="16"/>
+              </w:rPr>
+              <w:t xml:space="preserve">Rotterdam (descriptive)</w:t>
+            </w:r>
+          </w:p>
+        </w:tc>
+      </w:tr>
+      <w:tr>
+        <w:trPr>
+          <w:cantSplit/>
+        </w:trPr>
+        <w:tc>
+          <w:tcPr>
+            <w:tcW w:type="dxa" w:w="4200"/>
+            <w:tcMar>
+              <w:top w:type="dxa" w:w="50"/>
+              <w:left w:type="dxa" w:w="80"/>
+              <w:bottom w:type="dxa" w:w="50"/>
+              <w:right w:type="dxa" w:w="80"/>
+            </w:tcMar>
+          </w:tcPr>
+          <w:p>
+            <w:pPr>
+              <w:spacing w:after="0" w:line="240"/>
+              <w:jc w:val="left"/>
+            </w:pPr>
+            <w:r>
+              <w:rPr>
+                <w:rFonts w:ascii="Calibri" w:cs="Calibri" w:eastAsia="Calibri" w:hAnsi="Calibri"/>
+                <w:sz w:val="16"/>
+                <w:szCs w:val="16"/>
+              </w:rPr>
+              <w:t xml:space="preserve">the two rules select the same criterion set</w:t>
+            </w:r>
+          </w:p>
+        </w:tc>
+        <w:tc>
+          <w:tcPr>
+            <w:tcW w:type="dxa" w:w="2600"/>
+            <w:tcMar>
+              <w:top w:type="dxa" w:w="50"/>
+              <w:left w:type="dxa" w:w="80"/>
+              <w:bottom w:type="dxa" w:w="50"/>
+              <w:right w:type="dxa" w:w="80"/>
+            </w:tcMar>
+          </w:tcPr>
+          <w:p>
+            <w:pPr>
+              <w:spacing w:after="0" w:line="240"/>
+              <w:jc w:val="right"/>
+            </w:pPr>
+            <w:r>
+              <w:rPr>
+                <w:rFonts w:ascii="Calibri" w:cs="Calibri" w:eastAsia="Calibri" w:hAnsi="Calibri"/>
+                <w:sz w:val="16"/>
+                <w:szCs w:val="16"/>
+              </w:rPr>
+              <w:t xml:space="preserve">0.083</w:t>
+            </w:r>
+          </w:p>
+        </w:tc>
+        <w:tc>
+          <w:tcPr>
+            <w:tcW w:type="dxa" w:w="2560"/>
+            <w:tcMar>
+              <w:top w:type="dxa" w:w="50"/>
+              <w:left w:type="dxa" w:w="80"/>
+              <w:bottom w:type="dxa" w:w="50"/>
+              <w:right w:type="dxa" w:w="80"/>
+            </w:tcMar>
+          </w:tcPr>
+          <w:p>
+            <w:pPr>
+              <w:spacing w:after="0" w:line="240"/>
+              <w:jc w:val="right"/>
+            </w:pPr>
+            <w:r>
+              <w:rPr>
+                <w:rFonts w:ascii="Calibri" w:cs="Calibri" w:eastAsia="Calibri" w:hAnsi="Calibri"/>
+                <w:sz w:val="16"/>
+                <w:szCs w:val="16"/>
+              </w:rPr>
+              <w:t xml:space="preserve">0.068</w:t>
+            </w:r>
+          </w:p>
+        </w:tc>
+      </w:tr>
+      <w:tr>
+        <w:trPr>
+          <w:cantSplit/>
+        </w:trPr>
+        <w:tc>
+          <w:tcPr>
+            <w:tcW w:type="dxa" w:w="4200"/>
+            <w:tcMar>
+              <w:top w:type="dxa" w:w="50"/>
+              <w:left w:type="dxa" w:w="80"/>
+              <w:bottom w:type="dxa" w:w="50"/>
+              <w:right w:type="dxa" w:w="80"/>
+            </w:tcMar>
+          </w:tcPr>
+          <w:p>
+            <w:pPr>
+              <w:spacing w:after="0" w:line="240"/>
+              <w:jc w:val="left"/>
+            </w:pPr>
+            <w:r>
+              <w:rPr>
+                <w:rFonts w:ascii="Calibri" w:cs="Calibri" w:eastAsia="Calibri" w:hAnsi="Calibri"/>
+                <w:sz w:val="16"/>
+                <w:szCs w:val="16"/>
+              </w:rPr>
+              <w:t xml:space="preserve">eligible: full protocol</w:t>
+            </w:r>
+          </w:p>
+        </w:tc>
+        <w:tc>
+          <w:tcPr>
+            <w:tcW w:type="dxa" w:w="2600"/>
+            <w:tcMar>
+              <w:top w:type="dxa" w:w="50"/>
+              <w:left w:type="dxa" w:w="80"/>
+              <w:bottom w:type="dxa" w:w="50"/>
+              <w:right w:type="dxa" w:w="80"/>
+            </w:tcMar>
+          </w:tcPr>
+          <w:p>
+            <w:pPr>
+              <w:spacing w:after="0" w:line="240"/>
+              <w:jc w:val="right"/>
+            </w:pPr>
+            <w:r>
+              <w:rPr>
+                <w:rFonts w:ascii="Calibri" w:cs="Calibri" w:eastAsia="Calibri" w:hAnsi="Calibri"/>
+                <w:sz w:val="16"/>
+                <w:szCs w:val="16"/>
+              </w:rPr>
+              <w:t xml:space="preserve">89</w:t>
+            </w:r>
+          </w:p>
+        </w:tc>
+        <w:tc>
+          <w:tcPr>
+            <w:tcW w:type="dxa" w:w="2560"/>
+            <w:tcMar>
+              <w:top w:type="dxa" w:w="50"/>
+              <w:left w:type="dxa" w:w="80"/>
+              <w:bottom w:type="dxa" w:w="50"/>
+              <w:right w:type="dxa" w:w="80"/>
+            </w:tcMar>
+          </w:tcPr>
+          <w:p>
+            <w:pPr>
+              <w:spacing w:after="0" w:line="240"/>
+              <w:jc w:val="right"/>
+            </w:pPr>
+            <w:r>
+              <w:rPr>
+                <w:rFonts w:ascii="Calibri" w:cs="Calibri" w:eastAsia="Calibri" w:hAnsi="Calibri"/>
+                <w:sz w:val="16"/>
+                <w:szCs w:val="16"/>
+              </w:rPr>
+              <w:t xml:space="preserve">209</w:t>
+            </w:r>
+          </w:p>
+        </w:tc>
+      </w:tr>
+      <w:tr>
+        <w:trPr>
+          <w:cantSplit/>
+        </w:trPr>
+        <w:tc>
+          <w:tcPr>
+            <w:tcW w:type="dxa" w:w="4200"/>
+            <w:tcMar>
+              <w:top w:type="dxa" w:w="50"/>
+              <w:left w:type="dxa" w:w="80"/>
+              <w:bottom w:type="dxa" w:w="50"/>
+              <w:right w:type="dxa" w:w="80"/>
+            </w:tcMar>
+          </w:tcPr>
+          <w:p>
+            <w:pPr>
+              <w:spacing w:after="0" w:line="240"/>
+              <w:jc w:val="left"/>
+            </w:pPr>
+            <w:r>
+              <w:rPr>
+                <w:rFonts w:ascii="Calibri" w:cs="Calibri" w:eastAsia="Calibri" w:hAnsi="Calibri"/>
+                <w:sz w:val="16"/>
+                <w:szCs w:val="16"/>
+              </w:rPr>
+              <w:t xml:space="preserve">eligible: HR-selected rule</w:t>
+            </w:r>
+          </w:p>
+        </w:tc>
+        <w:tc>
+          <w:tcPr>
+            <w:tcW w:type="dxa" w:w="2600"/>
+            <w:tcMar>
+              <w:top w:type="dxa" w:w="50"/>
+              <w:left w:type="dxa" w:w="80"/>
+              <w:bottom w:type="dxa" w:w="50"/>
+              <w:right w:type="dxa" w:w="80"/>
+            </w:tcMar>
+          </w:tcPr>
+          <w:p>
+            <w:pPr>
+              <w:spacing w:after="0" w:line="240"/>
+              <w:jc w:val="right"/>
+            </w:pPr>
+            <w:r>
+              <w:rPr>
+                <w:rFonts w:ascii="Calibri" w:cs="Calibri" w:eastAsia="Calibri" w:hAnsi="Calibri"/>
+                <w:sz w:val="16"/>
+                <w:szCs w:val="16"/>
+              </w:rPr>
+              <w:t xml:space="preserve">149</w:t>
+            </w:r>
+          </w:p>
+        </w:tc>
+        <w:tc>
+          <w:tcPr>
+            <w:tcW w:type="dxa" w:w="2560"/>
+            <w:tcMar>
+              <w:top w:type="dxa" w:w="50"/>
+              <w:left w:type="dxa" w:w="80"/>
+              <w:bottom w:type="dxa" w:w="50"/>
+              <w:right w:type="dxa" w:w="80"/>
+            </w:tcMar>
+          </w:tcPr>
+          <w:p>
+            <w:pPr>
+              <w:spacing w:after="0" w:line="240"/>
+              <w:jc w:val="right"/>
+            </w:pPr>
+            <w:r>
+              <w:rPr>
+                <w:rFonts w:ascii="Calibri" w:cs="Calibri" w:eastAsia="Calibri" w:hAnsi="Calibri"/>
+                <w:sz w:val="16"/>
+                <w:szCs w:val="16"/>
+              </w:rPr>
+              <w:t xml:space="preserve">433</w:t>
+            </w:r>
+          </w:p>
+        </w:tc>
+      </w:tr>
+      <w:tr>
+        <w:trPr>
+          <w:cantSplit/>
+        </w:trPr>
+        <w:tc>
+          <w:tcPr>
+            <w:tcW w:type="dxa" w:w="4200"/>
+            <w:tcMar>
+              <w:top w:type="dxa" w:w="50"/>
+              <w:left w:type="dxa" w:w="80"/>
+              <w:bottom w:type="dxa" w:w="50"/>
+              <w:right w:type="dxa" w:w="80"/>
+            </w:tcMar>
+          </w:tcPr>
+          <w:p>
+            <w:pPr>
+              <w:spacing w:after="0" w:line="240"/>
+              <w:jc w:val="left"/>
+            </w:pPr>
+            <w:r>
+              <w:rPr>
+                <w:rFonts w:ascii="Calibri" w:cs="Calibri" w:eastAsia="Calibri" w:hAnsi="Calibri"/>
+                <w:sz w:val="16"/>
+                <w:szCs w:val="16"/>
+              </w:rPr>
+              <w:t xml:space="preserve">eligible: RMST-selected rule</w:t>
+            </w:r>
+          </w:p>
+        </w:tc>
+        <w:tc>
+          <w:tcPr>
+            <w:tcW w:type="dxa" w:w="2600"/>
+            <w:tcMar>
+              <w:top w:type="dxa" w:w="50"/>
+              <w:left w:type="dxa" w:w="80"/>
+              <w:bottom w:type="dxa" w:w="50"/>
+              <w:right w:type="dxa" w:w="80"/>
+            </w:tcMar>
+          </w:tcPr>
+          <w:p>
+            <w:pPr>
+              <w:spacing w:after="0" w:line="240"/>
+              <w:jc w:val="right"/>
+            </w:pPr>
+            <w:r>
+              <w:rPr>
+                <w:rFonts w:ascii="Calibri" w:cs="Calibri" w:eastAsia="Calibri" w:hAnsi="Calibri"/>
+                <w:sz w:val="16"/>
+                <w:szCs w:val="16"/>
+              </w:rPr>
+              <w:t xml:space="preserve">177</w:t>
+            </w:r>
+          </w:p>
+        </w:tc>
+        <w:tc>
+          <w:tcPr>
+            <w:tcW w:type="dxa" w:w="2560"/>
+            <w:tcMar>
+              <w:top w:type="dxa" w:w="50"/>
+              <w:left w:type="dxa" w:w="80"/>
+              <w:bottom w:type="dxa" w:w="50"/>
+              <w:right w:type="dxa" w:w="80"/>
+            </w:tcMar>
+          </w:tcPr>
+          <w:p>
+            <w:pPr>
+              <w:spacing w:after="0" w:line="240"/>
+              <w:jc w:val="right"/>
+            </w:pPr>
+            <w:r>
+              <w:rPr>
+                <w:rFonts w:ascii="Calibri" w:cs="Calibri" w:eastAsia="Calibri" w:hAnsi="Calibri"/>
+                <w:sz w:val="16"/>
+                <w:szCs w:val="16"/>
+              </w:rPr>
+              <w:t xml:space="preserve">427</w:t>
+            </w:r>
+          </w:p>
+        </w:tc>
+      </w:tr>
+      <w:tr>
+        <w:trPr>
+          <w:cantSplit/>
+        </w:trPr>
+        <w:tc>
+          <w:tcPr>
+            <w:tcW w:type="dxa" w:w="4200"/>
+            <w:tcMar>
+              <w:top w:type="dxa" w:w="50"/>
+              <w:left w:type="dxa" w:w="80"/>
+              <w:bottom w:type="dxa" w:w="50"/>
+              <w:right w:type="dxa" w:w="80"/>
+            </w:tcMar>
+          </w:tcPr>
+          <w:p>
+            <w:pPr>
+              <w:spacing w:after="0" w:line="240"/>
+              <w:jc w:val="left"/>
+            </w:pPr>
+            <w:r>
+              <w:rPr>
+                <w:rFonts w:ascii="Calibri" w:cs="Calibri" w:eastAsia="Calibri" w:hAnsi="Calibri"/>
+                <w:sz w:val="16"/>
+                <w:szCs w:val="16"/>
+              </w:rPr>
+              <w:t xml:space="preserve">HR-selected rule: P(lower HR)</w:t>
+            </w:r>
+          </w:p>
+        </w:tc>
+        <w:tc>
+          <w:tcPr>
+            <w:tcW w:type="dxa" w:w="2600"/>
+            <w:tcMar>
+              <w:top w:type="dxa" w:w="50"/>
+              <w:left w:type="dxa" w:w="80"/>
+              <w:bottom w:type="dxa" w:w="50"/>
+              <w:right w:type="dxa" w:w="80"/>
+            </w:tcMar>
+          </w:tcPr>
+          <w:p>
+            <w:pPr>
+              <w:spacing w:after="0" w:line="240"/>
+              <w:jc w:val="right"/>
+            </w:pPr>
+            <w:r>
+              <w:rPr>
+                <w:rFonts w:ascii="Calibri" w:cs="Calibri" w:eastAsia="Calibri" w:hAnsi="Calibri"/>
+                <w:sz w:val="16"/>
+                <w:szCs w:val="16"/>
+              </w:rPr>
+              <w:t xml:space="preserve">0.273</w:t>
+            </w:r>
+          </w:p>
+        </w:tc>
+        <w:tc>
+          <w:tcPr>
+            <w:tcW w:type="dxa" w:w="2560"/>
+            <w:tcMar>
+              <w:top w:type="dxa" w:w="50"/>
+              <w:left w:type="dxa" w:w="80"/>
+              <w:bottom w:type="dxa" w:w="50"/>
+              <w:right w:type="dxa" w:w="80"/>
+            </w:tcMar>
+          </w:tcPr>
+          <w:p>
+            <w:pPr>
+              <w:spacing w:after="0" w:line="240"/>
+              <w:jc w:val="right"/>
+            </w:pPr>
+            <w:r>
+              <w:rPr>
+                <w:rFonts w:ascii="Calibri" w:cs="Calibri" w:eastAsia="Calibri" w:hAnsi="Calibri"/>
+                <w:sz w:val="16"/>
+                <w:szCs w:val="16"/>
+              </w:rPr>
+              <w:t xml:space="preserve">0.464</w:t>
+            </w:r>
+          </w:p>
+        </w:tc>
+      </w:tr>
+      <w:tr>
+        <w:trPr>
+          <w:cantSplit/>
+        </w:trPr>
+        <w:tc>
+          <w:tcPr>
+            <w:tcW w:type="dxa" w:w="4200"/>
+            <w:tcMar>
+              <w:top w:type="dxa" w:w="50"/>
+              <w:left w:type="dxa" w:w="80"/>
+              <w:bottom w:type="dxa" w:w="50"/>
+              <w:right w:type="dxa" w:w="80"/>
+            </w:tcMar>
+          </w:tcPr>
+          <w:p>
+            <w:pPr>
+              <w:spacing w:after="0" w:line="240"/>
+              <w:jc w:val="left"/>
+            </w:pPr>
+            <w:r>
+              <w:rPr>
+                <w:rFonts w:ascii="Calibri" w:cs="Calibri" w:eastAsia="Calibri" w:hAnsi="Calibri"/>
+                <w:sz w:val="16"/>
+                <w:szCs w:val="16"/>
+              </w:rPr>
+              <w:t xml:space="preserve">HR-selected rule: P(greater RMST)</w:t>
+            </w:r>
+          </w:p>
+        </w:tc>
+        <w:tc>
+          <w:tcPr>
+            <w:tcW w:type="dxa" w:w="2600"/>
+            <w:tcMar>
+              <w:top w:type="dxa" w:w="50"/>
+              <w:left w:type="dxa" w:w="80"/>
+              <w:bottom w:type="dxa" w:w="50"/>
+              <w:right w:type="dxa" w:w="80"/>
+            </w:tcMar>
+          </w:tcPr>
+          <w:p>
+            <w:pPr>
+              <w:spacing w:after="0" w:line="240"/>
+              <w:jc w:val="right"/>
+            </w:pPr>
+            <w:r>
+              <w:rPr>
+                <w:rFonts w:ascii="Calibri" w:cs="Calibri" w:eastAsia="Calibri" w:hAnsi="Calibri"/>
+                <w:sz w:val="16"/>
+                <w:szCs w:val="16"/>
+              </w:rPr>
+              <w:t xml:space="preserve">0.473</w:t>
+            </w:r>
+          </w:p>
+        </w:tc>
+        <w:tc>
+          <w:tcPr>
+            <w:tcW w:type="dxa" w:w="2560"/>
+            <w:tcMar>
+              <w:top w:type="dxa" w:w="50"/>
+              <w:left w:type="dxa" w:w="80"/>
+              <w:bottom w:type="dxa" w:w="50"/>
+              <w:right w:type="dxa" w:w="80"/>
+            </w:tcMar>
+          </w:tcPr>
+          <w:p>
+            <w:pPr>
+              <w:spacing w:after="0" w:line="240"/>
+              <w:jc w:val="right"/>
+            </w:pPr>
+            <w:r>
+              <w:rPr>
+                <w:rFonts w:ascii="Calibri" w:cs="Calibri" w:eastAsia="Calibri" w:hAnsi="Calibri"/>
+                <w:sz w:val="16"/>
+                <w:szCs w:val="16"/>
+              </w:rPr>
+              <w:t xml:space="preserve">0.320</w:t>
+            </w:r>
+          </w:p>
+        </w:tc>
+      </w:tr>
+      <w:tr>
+        <w:trPr>
+          <w:cantSplit/>
+        </w:trPr>
+        <w:tc>
+          <w:tcPr>
+            <w:tcW w:type="dxa" w:w="4200"/>
+            <w:tcMar>
+              <w:top w:type="dxa" w:w="50"/>
+              <w:left w:type="dxa" w:w="80"/>
+              <w:bottom w:type="dxa" w:w="50"/>
+              <w:right w:type="dxa" w:w="80"/>
+            </w:tcMar>
+          </w:tcPr>
+          <w:p>
+            <w:pPr>
+              <w:spacing w:after="0" w:line="240"/>
+              <w:jc w:val="left"/>
+            </w:pPr>
+            <w:r>
+              <w:rPr>
+                <w:rFonts w:ascii="Calibri" w:cs="Calibri" w:eastAsia="Calibri" w:hAnsi="Calibri"/>
+                <w:sz w:val="16"/>
+                <w:szCs w:val="16"/>
+              </w:rPr>
+              <w:t xml:space="preserve">RMST-selected rule: P(lower HR)</w:t>
+            </w:r>
+          </w:p>
+        </w:tc>
+        <w:tc>
+          <w:tcPr>
+            <w:tcW w:type="dxa" w:w="2600"/>
+            <w:tcMar>
+              <w:top w:type="dxa" w:w="50"/>
+              <w:left w:type="dxa" w:w="80"/>
+              <w:bottom w:type="dxa" w:w="50"/>
+              <w:right w:type="dxa" w:w="80"/>
+            </w:tcMar>
+          </w:tcPr>
+          <w:p>
+            <w:pPr>
+              <w:spacing w:after="0" w:line="240"/>
+              <w:jc w:val="right"/>
+            </w:pPr>
+            <w:r>
+              <w:rPr>
+                <w:rFonts w:ascii="Calibri" w:cs="Calibri" w:eastAsia="Calibri" w:hAnsi="Calibri"/>
+                <w:sz w:val="16"/>
+                <w:szCs w:val="16"/>
+              </w:rPr>
+              <w:t xml:space="preserve">0.140</w:t>
+            </w:r>
+          </w:p>
+        </w:tc>
+        <w:tc>
+          <w:tcPr>
+            <w:tcW w:type="dxa" w:w="2560"/>
+            <w:tcMar>
+              <w:top w:type="dxa" w:w="50"/>
+              <w:left w:type="dxa" w:w="80"/>
+              <w:bottom w:type="dxa" w:w="50"/>
+              <w:right w:type="dxa" w:w="80"/>
+            </w:tcMar>
+          </w:tcPr>
+          <w:p>
+            <w:pPr>
+              <w:spacing w:after="0" w:line="240"/>
+              <w:jc w:val="right"/>
+            </w:pPr>
+            <w:r>
+              <w:rPr>
+                <w:rFonts w:ascii="Calibri" w:cs="Calibri" w:eastAsia="Calibri" w:hAnsi="Calibri"/>
+                <w:sz w:val="16"/>
+                <w:szCs w:val="16"/>
+              </w:rPr>
+              <w:t xml:space="preserve">0.404</w:t>
+            </w:r>
+          </w:p>
+        </w:tc>
+      </w:tr>
+      <w:tr>
+        <w:trPr>
+          <w:cantSplit/>
+        </w:trPr>
+        <w:tc>
+          <w:tcPr>
+            <w:tcW w:type="dxa" w:w="4200"/>
+            <w:tcMar>
+              <w:top w:type="dxa" w:w="50"/>
+              <w:left w:type="dxa" w:w="80"/>
+              <w:bottom w:type="dxa" w:w="50"/>
+              <w:right w:type="dxa" w:w="80"/>
+            </w:tcMar>
+          </w:tcPr>
+          <w:p>
+            <w:pPr>
+              <w:spacing w:after="0" w:line="240"/>
+              <w:jc w:val="left"/>
+            </w:pPr>
+            <w:r>
+              <w:rPr>
+                <w:rFonts w:ascii="Calibri" w:cs="Calibri" w:eastAsia="Calibri" w:hAnsi="Calibri"/>
+                <w:sz w:val="16"/>
+                <w:szCs w:val="16"/>
+              </w:rPr>
+              <w:t xml:space="preserve">RMST-selected rule: P(greater RMST)</w:t>
+            </w:r>
+          </w:p>
+        </w:tc>
+        <w:tc>
+          <w:tcPr>
+            <w:tcW w:type="dxa" w:w="2600"/>
+            <w:tcMar>
+              <w:top w:type="dxa" w:w="50"/>
+              <w:left w:type="dxa" w:w="80"/>
+              <w:bottom w:type="dxa" w:w="50"/>
+              <w:right w:type="dxa" w:w="80"/>
+            </w:tcMar>
+          </w:tcPr>
+          <w:p>
+            <w:pPr>
+              <w:spacing w:after="0" w:line="240"/>
+              <w:jc w:val="right"/>
+            </w:pPr>
+            <w:r>
+              <w:rPr>
+                <w:rFonts w:ascii="Calibri" w:cs="Calibri" w:eastAsia="Calibri" w:hAnsi="Calibri"/>
+                <w:sz w:val="16"/>
+                <w:szCs w:val="16"/>
+              </w:rPr>
+              <w:t xml:space="preserve">0.490</w:t>
+            </w:r>
+          </w:p>
+        </w:tc>
+        <w:tc>
+          <w:tcPr>
+            <w:tcW w:type="dxa" w:w="2560"/>
+            <w:tcMar>
+              <w:top w:type="dxa" w:w="50"/>
+              <w:left w:type="dxa" w:w="80"/>
+              <w:bottom w:type="dxa" w:w="50"/>
+              <w:right w:type="dxa" w:w="80"/>
+            </w:tcMar>
+          </w:tcPr>
+          <w:p>
+            <w:pPr>
+              <w:spacing w:after="0" w:line="240"/>
+              <w:jc w:val="right"/>
+            </w:pPr>
+            <w:r>
+              <w:rPr>
+                <w:rFonts w:ascii="Calibri" w:cs="Calibri" w:eastAsia="Calibri" w:hAnsi="Calibri"/>
+                <w:sz w:val="16"/>
+                <w:szCs w:val="16"/>
+              </w:rPr>
+              <w:t xml:space="preserve">0.268</w:t>
+            </w:r>
+          </w:p>
+        </w:tc>
+      </w:tr>
+    </w:tbl>
+    <w:p>
+      <w:pPr>
+        <w:spacing w:after="240" w:line="280"/>
+        <w:jc w:val="both"/>
+      </w:pPr>
+      <w:r>
+        <w:rPr>
+          <w:rFonts w:ascii="Calibri" w:cs="Calibri" w:eastAsia="Calibri" w:hAnsi="Calibri"/>
+          <w:color w:val="555555"/>
+          <w:sz w:val="17"/>
+          <w:szCs w:val="17"/>
+        </w:rPr>
+        <w:t xml:space="preserve">Switching the decomposition to the absolute-benefit estimand changes the selected criteria almost completely and improves neither estimand out of sample.</w:t>
       </w:r>
     </w:p>
     <w:p>

</xml_diff>